<commit_message>
Add GB conversion output
</commit_message>
<xml_diff>
--- a/Lab Report 07.docx
+++ b/Lab Report 07.docx
@@ -157,7 +157,7 @@
                   <w:sz w:val="72"/>
                   <w:szCs w:val="72"/>
                 </w:rPr>
-                <w:t>6</w:t>
+                <w:t>7</w:t>
               </w:r>
             </w:p>
           </w:sdtContent>
@@ -433,7 +433,25 @@
                                     <w:sz w:val="30"/>
                                     <w:szCs w:val="30"/>
                                   </w:rPr>
-                                  <w:t xml:space="preserve">Networking Fundamentals, Connectivity </w:t>
+                                  <w:t xml:space="preserve">GIT and </w:t>
+                                </w:r>
+                                <w:proofErr w:type="spellStart"/>
+                                <w:r>
+                                  <w:rPr>
+                                    <w:color w:val="215E99" w:themeColor="text2" w:themeTint="BF"/>
+                                    <w:sz w:val="30"/>
+                                    <w:szCs w:val="30"/>
+                                  </w:rPr>
+                                  <w:t>Github</w:t>
+                                </w:r>
+                                <w:proofErr w:type="spellEnd"/>
+                                <w:r>
+                                  <w:rPr>
+                                    <w:color w:val="215E99" w:themeColor="text2" w:themeTint="BF"/>
+                                    <w:sz w:val="30"/>
+                                    <w:szCs w:val="30"/>
+                                  </w:rPr>
+                                  <w:t xml:space="preserve"> </w:t>
                                 </w:r>
                                 <w:r>
                                   <w:rPr>
@@ -673,7 +691,25 @@
                               <w:sz w:val="30"/>
                               <w:szCs w:val="30"/>
                             </w:rPr>
-                            <w:t xml:space="preserve">Networking Fundamentals, Connectivity </w:t>
+                            <w:t xml:space="preserve">GIT and </w:t>
+                          </w:r>
+                          <w:proofErr w:type="spellStart"/>
+                          <w:r>
+                            <w:rPr>
+                              <w:color w:val="215E99" w:themeColor="text2" w:themeTint="BF"/>
+                              <w:sz w:val="30"/>
+                              <w:szCs w:val="30"/>
+                            </w:rPr>
+                            <w:t>Github</w:t>
+                          </w:r>
+                          <w:proofErr w:type="spellEnd"/>
+                          <w:r>
+                            <w:rPr>
+                              <w:color w:val="215E99" w:themeColor="text2" w:themeTint="BF"/>
+                              <w:sz w:val="30"/>
+                              <w:szCs w:val="30"/>
+                            </w:rPr>
+                            <w:t xml:space="preserve"> </w:t>
                           </w:r>
                           <w:r>
                             <w:rPr>
@@ -1323,1096 +1359,28 @@
     </w:p>
     <w:p>
       <w:pPr>
-        <w:pStyle w:val="BodyText"/>
-        <w:spacing w:before="251"/>
-        <w:ind w:left="120"/>
         <w:rPr>
-          <w:rFonts w:asciiTheme="minorHAnsi" w:hAnsiTheme="minorHAnsi"/>
-        </w:rPr>
-      </w:pPr>
-      <w:r>
-        <w:rPr>
-          <w:rFonts w:asciiTheme="minorHAnsi" w:hAnsiTheme="minorHAnsi"/>
-          <w:spacing w:val="-4"/>
-        </w:rPr>
-        <w:t>Run:</w:t>
-      </w:r>
-    </w:p>
-    <w:p>
-      <w:pPr>
-        <w:pStyle w:val="BodyText"/>
-        <w:spacing w:before="16"/>
-        <w:rPr>
-          <w:rFonts w:asciiTheme="minorHAnsi" w:hAnsiTheme="minorHAnsi"/>
-          <w:sz w:val="20"/>
-        </w:rPr>
-      </w:pPr>
-      <w:r>
-        <w:rPr>
-          <w:rFonts w:asciiTheme="minorHAnsi" w:hAnsiTheme="minorHAnsi"/>
-          <w:noProof/>
-          <w:sz w:val="20"/>
-        </w:rPr>
-        <mc:AlternateContent>
-          <mc:Choice Requires="wpg">
-            <w:drawing>
-              <wp:anchor distT="0" distB="0" distL="0" distR="0" simplePos="0" relativeHeight="251681792" behindDoc="1" locked="0" layoutInCell="1" allowOverlap="1" wp14:anchorId="40CA031C" wp14:editId="20E60E8F">
-                <wp:simplePos x="0" y="0"/>
-                <wp:positionH relativeFrom="page">
-                  <wp:posOffset>990600</wp:posOffset>
-                </wp:positionH>
-                <wp:positionV relativeFrom="paragraph">
-                  <wp:posOffset>198590</wp:posOffset>
-                </wp:positionV>
-                <wp:extent cx="5791200" cy="419100"/>
-                <wp:effectExtent l="0" t="0" r="0" b="0"/>
-                <wp:wrapTopAndBottom/>
-                <wp:docPr id="11" name="Group 11"/>
-                <wp:cNvGraphicFramePr>
-                  <a:graphicFrameLocks xmlns:a="http://schemas.openxmlformats.org/drawingml/2006/main"/>
-                </wp:cNvGraphicFramePr>
-                <a:graphic xmlns:a="http://schemas.openxmlformats.org/drawingml/2006/main">
-                  <a:graphicData uri="http://schemas.microsoft.com/office/word/2010/wordprocessingGroup">
-                    <wpg:wgp>
-                      <wpg:cNvGrpSpPr>
-                        <a:grpSpLocks/>
-                      </wpg:cNvGrpSpPr>
-                      <wpg:grpSpPr>
-                        <a:xfrm>
-                          <a:off x="0" y="0"/>
-                          <a:ext cx="5791200" cy="419100"/>
-                          <a:chOff x="0" y="0"/>
-                          <a:chExt cx="5791200" cy="419100"/>
-                        </a:xfrm>
-                      </wpg:grpSpPr>
-                      <wps:wsp>
-                        <wps:cNvPr id="12" name="Graphic 12"/>
-                        <wps:cNvSpPr/>
-                        <wps:spPr>
-                          <a:xfrm>
-                            <a:off x="0" y="0"/>
-                            <a:ext cx="5791200" cy="419100"/>
-                          </a:xfrm>
-                          <a:custGeom>
-                            <a:avLst/>
-                            <a:gdLst/>
-                            <a:ahLst/>
-                            <a:cxnLst/>
-                            <a:rect l="l" t="t" r="r" b="b"/>
-                            <a:pathLst>
-                              <a:path w="5791200" h="419100">
-                                <a:moveTo>
-                                  <a:pt x="5753100" y="419100"/>
-                                </a:moveTo>
-                                <a:lnTo>
-                                  <a:pt x="38100" y="419100"/>
-                                </a:lnTo>
-                                <a:lnTo>
-                                  <a:pt x="23306" y="416093"/>
-                                </a:lnTo>
-                                <a:lnTo>
-                                  <a:pt x="11191" y="407908"/>
-                                </a:lnTo>
-                                <a:lnTo>
-                                  <a:pt x="3006" y="395793"/>
-                                </a:lnTo>
-                                <a:lnTo>
-                                  <a:pt x="0" y="381000"/>
-                                </a:lnTo>
-                                <a:lnTo>
-                                  <a:pt x="0" y="38100"/>
-                                </a:lnTo>
-                                <a:lnTo>
-                                  <a:pt x="3006" y="23306"/>
-                                </a:lnTo>
-                                <a:lnTo>
-                                  <a:pt x="11191" y="11191"/>
-                                </a:lnTo>
-                                <a:lnTo>
-                                  <a:pt x="23306" y="3006"/>
-                                </a:lnTo>
-                                <a:lnTo>
-                                  <a:pt x="38100" y="0"/>
-                                </a:lnTo>
-                                <a:lnTo>
-                                  <a:pt x="5753100" y="0"/>
-                                </a:lnTo>
-                                <a:lnTo>
-                                  <a:pt x="5767893" y="3006"/>
-                                </a:lnTo>
-                                <a:lnTo>
-                                  <a:pt x="5777541" y="9525"/>
-                                </a:lnTo>
-                                <a:lnTo>
-                                  <a:pt x="38100" y="9525"/>
-                                </a:lnTo>
-                                <a:lnTo>
-                                  <a:pt x="27004" y="11779"/>
-                                </a:lnTo>
-                                <a:lnTo>
-                                  <a:pt x="17918" y="17918"/>
-                                </a:lnTo>
-                                <a:lnTo>
-                                  <a:pt x="11779" y="27004"/>
-                                </a:lnTo>
-                                <a:lnTo>
-                                  <a:pt x="9525" y="38100"/>
-                                </a:lnTo>
-                                <a:lnTo>
-                                  <a:pt x="9525" y="381000"/>
-                                </a:lnTo>
-                                <a:lnTo>
-                                  <a:pt x="11779" y="392095"/>
-                                </a:lnTo>
-                                <a:lnTo>
-                                  <a:pt x="17918" y="401181"/>
-                                </a:lnTo>
-                                <a:lnTo>
-                                  <a:pt x="27004" y="407320"/>
-                                </a:lnTo>
-                                <a:lnTo>
-                                  <a:pt x="38100" y="409575"/>
-                                </a:lnTo>
-                                <a:lnTo>
-                                  <a:pt x="5777541" y="409575"/>
-                                </a:lnTo>
-                                <a:lnTo>
-                                  <a:pt x="5767893" y="416093"/>
-                                </a:lnTo>
-                                <a:lnTo>
-                                  <a:pt x="5753100" y="419100"/>
-                                </a:lnTo>
-                                <a:close/>
-                              </a:path>
-                              <a:path w="5791200" h="419100">
-                                <a:moveTo>
-                                  <a:pt x="5777541" y="409575"/>
-                                </a:moveTo>
-                                <a:lnTo>
-                                  <a:pt x="5753100" y="409575"/>
-                                </a:lnTo>
-                                <a:lnTo>
-                                  <a:pt x="5764195" y="407320"/>
-                                </a:lnTo>
-                                <a:lnTo>
-                                  <a:pt x="5773281" y="401181"/>
-                                </a:lnTo>
-                                <a:lnTo>
-                                  <a:pt x="5779420" y="392095"/>
-                                </a:lnTo>
-                                <a:lnTo>
-                                  <a:pt x="5781675" y="381000"/>
-                                </a:lnTo>
-                                <a:lnTo>
-                                  <a:pt x="5781675" y="38100"/>
-                                </a:lnTo>
-                                <a:lnTo>
-                                  <a:pt x="5779420" y="27004"/>
-                                </a:lnTo>
-                                <a:lnTo>
-                                  <a:pt x="5773281" y="17918"/>
-                                </a:lnTo>
-                                <a:lnTo>
-                                  <a:pt x="5764195" y="11779"/>
-                                </a:lnTo>
-                                <a:lnTo>
-                                  <a:pt x="5753100" y="9525"/>
-                                </a:lnTo>
-                                <a:lnTo>
-                                  <a:pt x="5777541" y="9525"/>
-                                </a:lnTo>
-                                <a:lnTo>
-                                  <a:pt x="5780008" y="11191"/>
-                                </a:lnTo>
-                                <a:lnTo>
-                                  <a:pt x="5788193" y="23306"/>
-                                </a:lnTo>
-                                <a:lnTo>
-                                  <a:pt x="5791200" y="38100"/>
-                                </a:lnTo>
-                                <a:lnTo>
-                                  <a:pt x="5791200" y="381000"/>
-                                </a:lnTo>
-                                <a:lnTo>
-                                  <a:pt x="5788193" y="395793"/>
-                                </a:lnTo>
-                                <a:lnTo>
-                                  <a:pt x="5780008" y="407908"/>
-                                </a:lnTo>
-                                <a:lnTo>
-                                  <a:pt x="5777541" y="409575"/>
-                                </a:lnTo>
-                                <a:close/>
-                              </a:path>
-                            </a:pathLst>
-                          </a:custGeom>
-                          <a:solidFill>
-                            <a:srgbClr val="BABABA"/>
-                          </a:solidFill>
-                        </wps:spPr>
-                        <wps:bodyPr wrap="square" lIns="0" tIns="0" rIns="0" bIns="0" rtlCol="0">
-                          <a:prstTxWarp prst="textNoShape">
-                            <a:avLst/>
-                          </a:prstTxWarp>
-                          <a:noAutofit/>
-                        </wps:bodyPr>
-                      </wps:wsp>
-                      <wps:wsp>
-                        <wps:cNvPr id="13" name="Textbox 13"/>
-                        <wps:cNvSpPr txBox="1"/>
-                        <wps:spPr>
-                          <a:xfrm>
-                            <a:off x="0" y="0"/>
-                            <a:ext cx="5791200" cy="419100"/>
-                          </a:xfrm>
-                          <a:prstGeom prst="rect">
-                            <a:avLst/>
-                          </a:prstGeom>
-                        </wps:spPr>
-                        <wps:txbx>
-                          <w:txbxContent>
-                            <w:p>
-                              <w:pPr>
-                                <w:spacing w:before="242"/>
-                                <w:ind w:left="194"/>
-                                <w:rPr>
-                                  <w:rFonts w:ascii="Courier New"/>
-                                  <w:sz w:val="18"/>
-                                </w:rPr>
-                              </w:pPr>
-                              <w:r>
-                                <w:rPr>
-                                  <w:rFonts w:ascii="Courier New"/>
-                                  <w:spacing w:val="-2"/>
-                                  <w:sz w:val="18"/>
-                                </w:rPr>
-                                <w:t>hostname</w:t>
-                              </w:r>
-                            </w:p>
-                          </w:txbxContent>
-                        </wps:txbx>
-                        <wps:bodyPr wrap="square" lIns="0" tIns="0" rIns="0" bIns="0" rtlCol="0">
-                          <a:noAutofit/>
-                        </wps:bodyPr>
-                      </wps:wsp>
-                    </wpg:wgp>
-                  </a:graphicData>
-                </a:graphic>
-              </wp:anchor>
-            </w:drawing>
-          </mc:Choice>
-          <mc:Fallback>
-            <w:pict>
-              <v:group w14:anchorId="40CA031C" id="Group 11" o:spid="_x0000_s1028" style="position:absolute;margin-left:78pt;margin-top:15.65pt;width:456pt;height:33pt;z-index:-251634688;mso-wrap-distance-left:0;mso-wrap-distance-right:0;mso-position-horizontal-relative:page" coordsize="57912,4191" o:gfxdata="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">
-                <v:shape id="Graphic 12" o:spid="_x0000_s1029" style="position:absolute;width:57912;height:4191;visibility:visible;mso-wrap-style:square;v-text-anchor:top" coordsize="5791200,419100" o:gfxdata="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" path="m5753100,419100r-5715000,l23306,416093,11191,407908,3006,395793,,381000,,38100,3006,23306,11191,11191,23306,3006,38100,,5753100,r14793,3006l5777541,9525r-5739441,l27004,11779r-9086,6139l11779,27004,9525,38100r,342900l11779,392095r6139,9086l27004,407320r11096,2255l5777541,409575r-9648,6518l5753100,419100xem5777541,409575r-24441,l5764195,407320r9086,-6139l5779420,392095r2255,-11095l5781675,38100r-2255,-11096l5773281,17918r-9086,-6139l5753100,9525r24441,l5780008,11191r8185,12115l5791200,38100r,342900l5788193,395793r-8185,12115l5777541,409575xe" fillcolor="#bababa" stroked="f">
-                  <v:path arrowok="t"/>
-                </v:shape>
-                <v:shape id="Textbox 13" o:spid="_x0000_s1030" type="#_x0000_t202" style="position:absolute;width:57912;height:4191;visibility:visible;mso-wrap-style:square;v-text-anchor:top" o:gfxdata="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" filled="f" stroked="f">
-                  <v:textbox inset="0,0,0,0">
-                    <w:txbxContent>
-                      <w:p>
-                        <w:pPr>
-                          <w:spacing w:before="242"/>
-                          <w:ind w:left="194"/>
-                          <w:rPr>
-                            <w:rFonts w:ascii="Courier New"/>
-                            <w:sz w:val="18"/>
-                          </w:rPr>
-                        </w:pPr>
-                        <w:r>
-                          <w:rPr>
-                            <w:rFonts w:ascii="Courier New"/>
-                            <w:spacing w:val="-2"/>
-                            <w:sz w:val="18"/>
-                          </w:rPr>
-                          <w:t>hostname</w:t>
-                        </w:r>
-                      </w:p>
-                    </w:txbxContent>
-                  </v:textbox>
-                </v:shape>
-                <w10:wrap type="topAndBottom" anchorx="page"/>
-              </v:group>
-            </w:pict>
-          </mc:Fallback>
-        </mc:AlternateContent>
-      </w:r>
-    </w:p>
-    <w:p/>
-    <w:p>
-      <w:pPr>
-        <w:pStyle w:val="BodyText"/>
-        <w:rPr>
-          <w:rFonts w:asciiTheme="minorHAnsi" w:hAnsiTheme="minorHAnsi"/>
-        </w:rPr>
-      </w:pPr>
-      <w:r>
-        <w:rPr>
-          <w:rFonts w:asciiTheme="minorHAnsi" w:hAnsiTheme="minorHAnsi"/>
-        </w:rPr>
-        <w:t xml:space="preserve">  </w:t>
-      </w:r>
-      <w:r>
-        <w:rPr>
-          <w:rFonts w:asciiTheme="minorHAnsi" w:hAnsiTheme="minorHAnsi"/>
-        </w:rPr>
-        <w:t>Record</w:t>
-      </w:r>
-      <w:r>
-        <w:rPr>
-          <w:rFonts w:asciiTheme="minorHAnsi" w:hAnsiTheme="minorHAnsi"/>
-          <w:spacing w:val="-12"/>
-        </w:rPr>
-        <w:t xml:space="preserve"> </w:t>
-      </w:r>
-      <w:r>
-        <w:rPr>
-          <w:rFonts w:asciiTheme="minorHAnsi" w:hAnsiTheme="minorHAnsi"/>
-        </w:rPr>
-        <w:t>your</w:t>
-      </w:r>
-      <w:r>
-        <w:rPr>
-          <w:rFonts w:asciiTheme="minorHAnsi" w:hAnsiTheme="minorHAnsi"/>
-          <w:spacing w:val="-12"/>
-        </w:rPr>
-        <w:t xml:space="preserve"> h</w:t>
-      </w:r>
-      <w:r>
-        <w:rPr>
-          <w:rFonts w:asciiTheme="minorHAnsi" w:hAnsiTheme="minorHAnsi"/>
-        </w:rPr>
-        <w:t>ostname. Then run:</w:t>
-      </w:r>
-    </w:p>
-    <w:p>
-      <w:pPr>
-        <w:pStyle w:val="BodyText"/>
-        <w:rPr>
-          <w:rFonts w:asciiTheme="minorHAnsi" w:hAnsiTheme="minorHAnsi"/>
-        </w:rPr>
-      </w:pPr>
-    </w:p>
-    <w:p>
-      <w:pPr>
-        <w:ind w:left="120"/>
-        <w:rPr>
-          <w:sz w:val="20"/>
-        </w:rPr>
-      </w:pPr>
-      <w:r>
-        <w:rPr>
-          <w:noProof/>
-          <w:sz w:val="20"/>
-        </w:rPr>
-        <mc:AlternateContent>
-          <mc:Choice Requires="wpg">
-            <w:drawing>
-              <wp:inline distT="0" distB="0" distL="0" distR="0" wp14:anchorId="34C93F12" wp14:editId="27855514">
-                <wp:extent cx="5791200" cy="419100"/>
-                <wp:effectExtent l="0" t="0" r="0" b="0"/>
-                <wp:docPr id="14" name="Group 14"/>
-                <wp:cNvGraphicFramePr>
-                  <a:graphicFrameLocks xmlns:a="http://schemas.openxmlformats.org/drawingml/2006/main"/>
-                </wp:cNvGraphicFramePr>
-                <a:graphic xmlns:a="http://schemas.openxmlformats.org/drawingml/2006/main">
-                  <a:graphicData uri="http://schemas.microsoft.com/office/word/2010/wordprocessingGroup">
-                    <wpg:wgp>
-                      <wpg:cNvGrpSpPr>
-                        <a:grpSpLocks/>
-                      </wpg:cNvGrpSpPr>
-                      <wpg:grpSpPr>
-                        <a:xfrm>
-                          <a:off x="0" y="0"/>
-                          <a:ext cx="5791200" cy="419100"/>
-                          <a:chOff x="0" y="0"/>
-                          <a:chExt cx="5791200" cy="419100"/>
-                        </a:xfrm>
-                      </wpg:grpSpPr>
-                      <wps:wsp>
-                        <wps:cNvPr id="15" name="Graphic 15"/>
-                        <wps:cNvSpPr/>
-                        <wps:spPr>
-                          <a:xfrm>
-                            <a:off x="0" y="0"/>
-                            <a:ext cx="5791200" cy="419100"/>
-                          </a:xfrm>
-                          <a:custGeom>
-                            <a:avLst/>
-                            <a:gdLst/>
-                            <a:ahLst/>
-                            <a:cxnLst/>
-                            <a:rect l="l" t="t" r="r" b="b"/>
-                            <a:pathLst>
-                              <a:path w="5791200" h="419100">
-                                <a:moveTo>
-                                  <a:pt x="5753100" y="419100"/>
-                                </a:moveTo>
-                                <a:lnTo>
-                                  <a:pt x="38100" y="419100"/>
-                                </a:lnTo>
-                                <a:lnTo>
-                                  <a:pt x="23306" y="416093"/>
-                                </a:lnTo>
-                                <a:lnTo>
-                                  <a:pt x="11191" y="407908"/>
-                                </a:lnTo>
-                                <a:lnTo>
-                                  <a:pt x="3006" y="395793"/>
-                                </a:lnTo>
-                                <a:lnTo>
-                                  <a:pt x="0" y="381000"/>
-                                </a:lnTo>
-                                <a:lnTo>
-                                  <a:pt x="0" y="38100"/>
-                                </a:lnTo>
-                                <a:lnTo>
-                                  <a:pt x="3006" y="23306"/>
-                                </a:lnTo>
-                                <a:lnTo>
-                                  <a:pt x="11191" y="11191"/>
-                                </a:lnTo>
-                                <a:lnTo>
-                                  <a:pt x="23306" y="3006"/>
-                                </a:lnTo>
-                                <a:lnTo>
-                                  <a:pt x="38100" y="0"/>
-                                </a:lnTo>
-                                <a:lnTo>
-                                  <a:pt x="5753100" y="0"/>
-                                </a:lnTo>
-                                <a:lnTo>
-                                  <a:pt x="5767893" y="3006"/>
-                                </a:lnTo>
-                                <a:lnTo>
-                                  <a:pt x="5777541" y="9525"/>
-                                </a:lnTo>
-                                <a:lnTo>
-                                  <a:pt x="38100" y="9525"/>
-                                </a:lnTo>
-                                <a:lnTo>
-                                  <a:pt x="27004" y="11779"/>
-                                </a:lnTo>
-                                <a:lnTo>
-                                  <a:pt x="17918" y="17918"/>
-                                </a:lnTo>
-                                <a:lnTo>
-                                  <a:pt x="11779" y="27004"/>
-                                </a:lnTo>
-                                <a:lnTo>
-                                  <a:pt x="9525" y="38100"/>
-                                </a:lnTo>
-                                <a:lnTo>
-                                  <a:pt x="9525" y="381000"/>
-                                </a:lnTo>
-                                <a:lnTo>
-                                  <a:pt x="11779" y="392095"/>
-                                </a:lnTo>
-                                <a:lnTo>
-                                  <a:pt x="17918" y="401181"/>
-                                </a:lnTo>
-                                <a:lnTo>
-                                  <a:pt x="27004" y="407320"/>
-                                </a:lnTo>
-                                <a:lnTo>
-                                  <a:pt x="38100" y="409575"/>
-                                </a:lnTo>
-                                <a:lnTo>
-                                  <a:pt x="5777541" y="409575"/>
-                                </a:lnTo>
-                                <a:lnTo>
-                                  <a:pt x="5767893" y="416093"/>
-                                </a:lnTo>
-                                <a:lnTo>
-                                  <a:pt x="5753100" y="419100"/>
-                                </a:lnTo>
-                                <a:close/>
-                              </a:path>
-                              <a:path w="5791200" h="419100">
-                                <a:moveTo>
-                                  <a:pt x="5777541" y="409575"/>
-                                </a:moveTo>
-                                <a:lnTo>
-                                  <a:pt x="5753100" y="409575"/>
-                                </a:lnTo>
-                                <a:lnTo>
-                                  <a:pt x="5764195" y="407320"/>
-                                </a:lnTo>
-                                <a:lnTo>
-                                  <a:pt x="5773281" y="401181"/>
-                                </a:lnTo>
-                                <a:lnTo>
-                                  <a:pt x="5779420" y="392095"/>
-                                </a:lnTo>
-                                <a:lnTo>
-                                  <a:pt x="5781675" y="381000"/>
-                                </a:lnTo>
-                                <a:lnTo>
-                                  <a:pt x="5781675" y="38100"/>
-                                </a:lnTo>
-                                <a:lnTo>
-                                  <a:pt x="5779420" y="27004"/>
-                                </a:lnTo>
-                                <a:lnTo>
-                                  <a:pt x="5773281" y="17918"/>
-                                </a:lnTo>
-                                <a:lnTo>
-                                  <a:pt x="5764195" y="11779"/>
-                                </a:lnTo>
-                                <a:lnTo>
-                                  <a:pt x="5753100" y="9525"/>
-                                </a:lnTo>
-                                <a:lnTo>
-                                  <a:pt x="5777541" y="9525"/>
-                                </a:lnTo>
-                                <a:lnTo>
-                                  <a:pt x="5780008" y="11191"/>
-                                </a:lnTo>
-                                <a:lnTo>
-                                  <a:pt x="5788193" y="23306"/>
-                                </a:lnTo>
-                                <a:lnTo>
-                                  <a:pt x="5791200" y="38100"/>
-                                </a:lnTo>
-                                <a:lnTo>
-                                  <a:pt x="5791200" y="381000"/>
-                                </a:lnTo>
-                                <a:lnTo>
-                                  <a:pt x="5788193" y="395793"/>
-                                </a:lnTo>
-                                <a:lnTo>
-                                  <a:pt x="5780008" y="407908"/>
-                                </a:lnTo>
-                                <a:lnTo>
-                                  <a:pt x="5777541" y="409575"/>
-                                </a:lnTo>
-                                <a:close/>
-                              </a:path>
-                            </a:pathLst>
-                          </a:custGeom>
-                          <a:solidFill>
-                            <a:srgbClr val="BABABA"/>
-                          </a:solidFill>
-                        </wps:spPr>
-                        <wps:bodyPr wrap="square" lIns="0" tIns="0" rIns="0" bIns="0" rtlCol="0">
-                          <a:prstTxWarp prst="textNoShape">
-                            <a:avLst/>
-                          </a:prstTxWarp>
-                          <a:noAutofit/>
-                        </wps:bodyPr>
-                      </wps:wsp>
-                      <wps:wsp>
-                        <wps:cNvPr id="16" name="Textbox 16"/>
-                        <wps:cNvSpPr txBox="1"/>
-                        <wps:spPr>
-                          <a:xfrm>
-                            <a:off x="0" y="0"/>
-                            <a:ext cx="5791200" cy="419100"/>
-                          </a:xfrm>
-                          <a:prstGeom prst="rect">
-                            <a:avLst/>
-                          </a:prstGeom>
-                        </wps:spPr>
-                        <wps:txbx>
-                          <w:txbxContent>
-                            <w:p>
-                              <w:pPr>
-                                <w:spacing w:before="242"/>
-                                <w:ind w:left="194"/>
-                                <w:rPr>
-                                  <w:rFonts w:ascii="Courier New"/>
-                                  <w:sz w:val="18"/>
-                                </w:rPr>
-                              </w:pPr>
-                              <w:r>
-                                <w:rPr>
-                                  <w:rFonts w:ascii="Courier New"/>
-                                  <w:sz w:val="18"/>
-                                </w:rPr>
-                                <w:t xml:space="preserve">ipconfig </w:t>
-                              </w:r>
-                              <w:r>
-                                <w:rPr>
-                                  <w:rFonts w:ascii="Courier New"/>
-                                  <w:spacing w:val="-4"/>
-                                  <w:sz w:val="18"/>
-                                </w:rPr>
-                                <w:t>/all</w:t>
-                              </w:r>
-                            </w:p>
-                          </w:txbxContent>
-                        </wps:txbx>
-                        <wps:bodyPr wrap="square" lIns="0" tIns="0" rIns="0" bIns="0" rtlCol="0">
-                          <a:noAutofit/>
-                        </wps:bodyPr>
-                      </wps:wsp>
-                    </wpg:wgp>
-                  </a:graphicData>
-                </a:graphic>
-              </wp:inline>
-            </w:drawing>
-          </mc:Choice>
-          <mc:Fallback>
-            <w:pict>
-              <v:group w14:anchorId="34C93F12" id="Group 14" o:spid="_x0000_s1031" style="width:456pt;height:33pt;mso-position-horizontal-relative:char;mso-position-vertical-relative:line" coordsize="57912,4191" o:gfxdata="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">
-                <v:shape id="Graphic 15" o:spid="_x0000_s1032" style="position:absolute;width:57912;height:4191;visibility:visible;mso-wrap-style:square;v-text-anchor:top" coordsize="5791200,419100" o:gfxdata="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" path="m5753100,419100r-5715000,l23306,416093,11191,407908,3006,395793,,381000,,38100,3006,23306,11191,11191,23306,3006,38100,,5753100,r14793,3006l5777541,9525r-5739441,l27004,11779r-9086,6139l11779,27004,9525,38100r,342900l11779,392095r6139,9086l27004,407320r11096,2255l5777541,409575r-9648,6518l5753100,419100xem5777541,409575r-24441,l5764195,407320r9086,-6139l5779420,392095r2255,-11095l5781675,38100r-2255,-11096l5773281,17918r-9086,-6139l5753100,9525r24441,l5780008,11191r8185,12115l5791200,38100r,342900l5788193,395793r-8185,12115l5777541,409575xe" fillcolor="#bababa" stroked="f">
-                  <v:path arrowok="t"/>
-                </v:shape>
-                <v:shape id="Textbox 16" o:spid="_x0000_s1033" type="#_x0000_t202" style="position:absolute;width:57912;height:4191;visibility:visible;mso-wrap-style:square;v-text-anchor:top" o:gfxdata="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" filled="f" stroked="f">
-                  <v:textbox inset="0,0,0,0">
-                    <w:txbxContent>
-                      <w:p>
-                        <w:pPr>
-                          <w:spacing w:before="242"/>
-                          <w:ind w:left="194"/>
-                          <w:rPr>
-                            <w:rFonts w:ascii="Courier New"/>
-                            <w:sz w:val="18"/>
-                          </w:rPr>
-                        </w:pPr>
-                        <w:r>
-                          <w:rPr>
-                            <w:rFonts w:ascii="Courier New"/>
-                            <w:sz w:val="18"/>
-                          </w:rPr>
-                          <w:t xml:space="preserve">ipconfig </w:t>
-                        </w:r>
-                        <w:r>
-                          <w:rPr>
-                            <w:rFonts w:ascii="Courier New"/>
-                            <w:spacing w:val="-4"/>
-                            <w:sz w:val="18"/>
-                          </w:rPr>
-                          <w:t>/all</w:t>
-                        </w:r>
-                      </w:p>
-                    </w:txbxContent>
-                  </v:textbox>
-                </v:shape>
-                <w10:anchorlock/>
-              </v:group>
-            </w:pict>
-          </mc:Fallback>
-        </mc:AlternateContent>
-      </w:r>
-    </w:p>
-    <w:p>
-      <w:r>
-        <w:t>Find the active network interface. Record:</w:t>
-      </w:r>
-    </w:p>
-    <w:tbl>
-      <w:tblPr>
-        <w:tblW w:w="0" w:type="auto"/>
-        <w:tblInd w:w="3005" w:type="dxa"/>
-        <w:tblBorders>
-          <w:top w:val="single" w:sz="6" w:space="0" w:color="000000"/>
-          <w:left w:val="single" w:sz="6" w:space="0" w:color="000000"/>
-          <w:bottom w:val="single" w:sz="6" w:space="0" w:color="000000"/>
-          <w:right w:val="single" w:sz="6" w:space="0" w:color="000000"/>
-          <w:insideH w:val="single" w:sz="6" w:space="0" w:color="000000"/>
-          <w:insideV w:val="single" w:sz="6" w:space="0" w:color="000000"/>
-        </w:tblBorders>
-        <w:tblLayout w:type="fixed"/>
-        <w:tblCellMar>
-          <w:left w:w="0" w:type="dxa"/>
-          <w:right w:w="0" w:type="dxa"/>
-        </w:tblCellMar>
-        <w:tblLook w:val="01E0" w:firstRow="1" w:lastRow="1" w:firstColumn="1" w:lastColumn="1" w:noHBand="0" w:noVBand="0"/>
-      </w:tblPr>
-      <w:tblGrid>
-        <w:gridCol w:w="1430"/>
-        <w:gridCol w:w="1933"/>
-      </w:tblGrid>
-      <w:tr>
-        <w:trPr>
-          <w:trHeight w:val="332"/>
-        </w:trPr>
-        <w:tc>
-          <w:tcPr>
-            <w:tcW w:w="1430" w:type="dxa"/>
-            <w:tcBorders>
-              <w:top w:val="nil"/>
-              <w:left w:val="nil"/>
-              <w:right w:val="nil"/>
-            </w:tcBorders>
-          </w:tcPr>
-          <w:p>
-            <w:pPr>
-              <w:pStyle w:val="TableParagraph"/>
-              <w:ind w:left="165"/>
-              <w:rPr>
-                <w:rFonts w:asciiTheme="minorHAnsi" w:hAnsiTheme="minorHAnsi"/>
-                <w:sz w:val="18"/>
-              </w:rPr>
-            </w:pPr>
-            <w:r>
-              <w:rPr>
-                <w:rFonts w:asciiTheme="minorHAnsi" w:hAnsiTheme="minorHAnsi"/>
-                <w:spacing w:val="-4"/>
-                <w:sz w:val="18"/>
-              </w:rPr>
-              <w:t>Item</w:t>
-            </w:r>
-          </w:p>
-        </w:tc>
-        <w:tc>
-          <w:tcPr>
-            <w:tcW w:w="1933" w:type="dxa"/>
-            <w:tcBorders>
-              <w:top w:val="nil"/>
-              <w:left w:val="nil"/>
-              <w:right w:val="nil"/>
-            </w:tcBorders>
-          </w:tcPr>
-          <w:p>
-            <w:pPr>
-              <w:pStyle w:val="TableParagraph"/>
-              <w:ind w:left="884"/>
-              <w:rPr>
-                <w:rFonts w:asciiTheme="minorHAnsi" w:hAnsiTheme="minorHAnsi"/>
-                <w:sz w:val="18"/>
-              </w:rPr>
-            </w:pPr>
-            <w:r>
-              <w:rPr>
-                <w:rFonts w:asciiTheme="minorHAnsi" w:hAnsiTheme="minorHAnsi"/>
-                <w:sz w:val="18"/>
-              </w:rPr>
-              <w:t>Your</w:t>
-            </w:r>
-            <w:r>
-              <w:rPr>
-                <w:rFonts w:asciiTheme="minorHAnsi" w:hAnsiTheme="minorHAnsi"/>
-                <w:spacing w:val="-9"/>
-                <w:sz w:val="18"/>
-              </w:rPr>
-              <w:t xml:space="preserve"> </w:t>
-            </w:r>
-            <w:r>
-              <w:rPr>
-                <w:rFonts w:asciiTheme="minorHAnsi" w:hAnsiTheme="minorHAnsi"/>
-                <w:spacing w:val="-2"/>
-                <w:sz w:val="18"/>
-              </w:rPr>
-              <w:t>Value</w:t>
-            </w:r>
-          </w:p>
-        </w:tc>
-      </w:tr>
-      <w:tr>
-        <w:trPr>
-          <w:trHeight w:val="420"/>
-        </w:trPr>
-        <w:tc>
-          <w:tcPr>
-            <w:tcW w:w="3363" w:type="dxa"/>
-            <w:gridSpan w:val="2"/>
-            <w:tcBorders>
-              <w:left w:val="single" w:sz="6" w:space="0" w:color="FFFFFF"/>
-              <w:bottom w:val="single" w:sz="6" w:space="0" w:color="BABABA"/>
-              <w:right w:val="single" w:sz="6" w:space="0" w:color="FFFFFF"/>
-            </w:tcBorders>
-          </w:tcPr>
-          <w:p>
-            <w:pPr>
-              <w:pStyle w:val="TableParagraph"/>
-              <w:spacing w:before="87"/>
-              <w:rPr>
-                <w:rFonts w:asciiTheme="minorHAnsi" w:hAnsiTheme="minorHAnsi"/>
-                <w:sz w:val="18"/>
-              </w:rPr>
-            </w:pPr>
-            <w:r>
-              <w:rPr>
-                <w:rFonts w:asciiTheme="minorHAnsi" w:hAnsiTheme="minorHAnsi"/>
-                <w:spacing w:val="-2"/>
-                <w:sz w:val="18"/>
-              </w:rPr>
-              <w:t>Hostname</w:t>
-            </w:r>
-          </w:p>
-        </w:tc>
-      </w:tr>
-      <w:tr>
-        <w:trPr>
-          <w:trHeight w:val="420"/>
-        </w:trPr>
-        <w:tc>
-          <w:tcPr>
-            <w:tcW w:w="3363" w:type="dxa"/>
-            <w:gridSpan w:val="2"/>
-            <w:tcBorders>
-              <w:top w:val="single" w:sz="6" w:space="0" w:color="BABABA"/>
-              <w:left w:val="single" w:sz="6" w:space="0" w:color="FFFFFF"/>
-              <w:bottom w:val="single" w:sz="6" w:space="0" w:color="BABABA"/>
-              <w:right w:val="single" w:sz="6" w:space="0" w:color="FFFFFF"/>
-            </w:tcBorders>
-          </w:tcPr>
-          <w:p>
-            <w:pPr>
-              <w:pStyle w:val="TableParagraph"/>
-              <w:spacing w:before="87"/>
-              <w:rPr>
-                <w:rFonts w:asciiTheme="minorHAnsi" w:hAnsiTheme="minorHAnsi"/>
-                <w:sz w:val="18"/>
-              </w:rPr>
-            </w:pPr>
-            <w:r>
-              <w:rPr>
-                <w:rFonts w:asciiTheme="minorHAnsi" w:hAnsiTheme="minorHAnsi"/>
-                <w:spacing w:val="-2"/>
-                <w:sz w:val="18"/>
-              </w:rPr>
-              <w:t>Adapter/interface</w:t>
-            </w:r>
-          </w:p>
-        </w:tc>
-      </w:tr>
-      <w:tr>
-        <w:trPr>
-          <w:trHeight w:val="420"/>
-        </w:trPr>
-        <w:tc>
-          <w:tcPr>
-            <w:tcW w:w="3363" w:type="dxa"/>
-            <w:gridSpan w:val="2"/>
-            <w:tcBorders>
-              <w:top w:val="single" w:sz="6" w:space="0" w:color="BABABA"/>
-              <w:left w:val="single" w:sz="6" w:space="0" w:color="FFFFFF"/>
-              <w:bottom w:val="single" w:sz="6" w:space="0" w:color="BABABA"/>
-              <w:right w:val="single" w:sz="6" w:space="0" w:color="FFFFFF"/>
-            </w:tcBorders>
-          </w:tcPr>
-          <w:p>
-            <w:pPr>
-              <w:pStyle w:val="TableParagraph"/>
-              <w:spacing w:before="87"/>
-              <w:rPr>
-                <w:rFonts w:asciiTheme="minorHAnsi" w:hAnsiTheme="minorHAnsi"/>
-                <w:sz w:val="18"/>
-              </w:rPr>
-            </w:pPr>
-            <w:r>
-              <w:rPr>
-                <w:rFonts w:asciiTheme="minorHAnsi" w:hAnsiTheme="minorHAnsi"/>
-                <w:sz w:val="18"/>
-              </w:rPr>
-              <w:t xml:space="preserve">IPv4 </w:t>
-            </w:r>
-            <w:r>
-              <w:rPr>
-                <w:rFonts w:asciiTheme="minorHAnsi" w:hAnsiTheme="minorHAnsi"/>
-                <w:spacing w:val="-2"/>
-                <w:sz w:val="18"/>
-              </w:rPr>
-              <w:t>address</w:t>
-            </w:r>
-          </w:p>
-        </w:tc>
-      </w:tr>
-      <w:tr>
-        <w:trPr>
-          <w:trHeight w:val="420"/>
-        </w:trPr>
-        <w:tc>
-          <w:tcPr>
-            <w:tcW w:w="3363" w:type="dxa"/>
-            <w:gridSpan w:val="2"/>
-            <w:tcBorders>
-              <w:top w:val="single" w:sz="6" w:space="0" w:color="BABABA"/>
-              <w:left w:val="single" w:sz="6" w:space="0" w:color="FFFFFF"/>
-              <w:bottom w:val="single" w:sz="6" w:space="0" w:color="BABABA"/>
-              <w:right w:val="single" w:sz="6" w:space="0" w:color="FFFFFF"/>
-            </w:tcBorders>
-          </w:tcPr>
-          <w:p>
-            <w:pPr>
-              <w:pStyle w:val="TableParagraph"/>
-              <w:spacing w:before="87"/>
-              <w:rPr>
-                <w:rFonts w:asciiTheme="minorHAnsi" w:hAnsiTheme="minorHAnsi"/>
-                <w:sz w:val="18"/>
-              </w:rPr>
-            </w:pPr>
-            <w:r>
-              <w:rPr>
-                <w:rFonts w:asciiTheme="minorHAnsi" w:hAnsiTheme="minorHAnsi"/>
-                <w:sz w:val="18"/>
-              </w:rPr>
-              <w:t xml:space="preserve">Subnet </w:t>
-            </w:r>
-            <w:r>
-              <w:rPr>
-                <w:rFonts w:asciiTheme="minorHAnsi" w:hAnsiTheme="minorHAnsi"/>
-                <w:spacing w:val="-4"/>
-                <w:sz w:val="18"/>
-              </w:rPr>
-              <w:t>mask</w:t>
-            </w:r>
-          </w:p>
-        </w:tc>
-      </w:tr>
-      <w:tr>
-        <w:trPr>
-          <w:trHeight w:val="420"/>
-        </w:trPr>
-        <w:tc>
-          <w:tcPr>
-            <w:tcW w:w="3363" w:type="dxa"/>
-            <w:gridSpan w:val="2"/>
-            <w:tcBorders>
-              <w:top w:val="single" w:sz="6" w:space="0" w:color="BABABA"/>
-              <w:left w:val="single" w:sz="6" w:space="0" w:color="FFFFFF"/>
-              <w:bottom w:val="single" w:sz="6" w:space="0" w:color="BABABA"/>
-              <w:right w:val="single" w:sz="6" w:space="0" w:color="FFFFFF"/>
-            </w:tcBorders>
-          </w:tcPr>
-          <w:p>
-            <w:pPr>
-              <w:pStyle w:val="TableParagraph"/>
-              <w:spacing w:before="87"/>
-              <w:rPr>
-                <w:rFonts w:asciiTheme="minorHAnsi" w:hAnsiTheme="minorHAnsi"/>
-                <w:sz w:val="18"/>
-              </w:rPr>
-            </w:pPr>
-            <w:r>
-              <w:rPr>
-                <w:rFonts w:asciiTheme="minorHAnsi" w:hAnsiTheme="minorHAnsi"/>
-                <w:sz w:val="18"/>
-              </w:rPr>
-              <w:t>Default</w:t>
-            </w:r>
-            <w:r>
-              <w:rPr>
-                <w:rFonts w:asciiTheme="minorHAnsi" w:hAnsiTheme="minorHAnsi"/>
-                <w:spacing w:val="-2"/>
-                <w:sz w:val="18"/>
-              </w:rPr>
-              <w:t xml:space="preserve"> gateway</w:t>
-            </w:r>
-          </w:p>
-        </w:tc>
-      </w:tr>
-      <w:tr>
-        <w:trPr>
-          <w:trHeight w:val="420"/>
-        </w:trPr>
-        <w:tc>
-          <w:tcPr>
-            <w:tcW w:w="3363" w:type="dxa"/>
-            <w:gridSpan w:val="2"/>
-            <w:tcBorders>
-              <w:top w:val="single" w:sz="6" w:space="0" w:color="BABABA"/>
-              <w:left w:val="single" w:sz="6" w:space="0" w:color="FFFFFF"/>
-              <w:bottom w:val="single" w:sz="6" w:space="0" w:color="BABABA"/>
-              <w:right w:val="single" w:sz="6" w:space="0" w:color="FFFFFF"/>
-            </w:tcBorders>
-          </w:tcPr>
-          <w:p>
-            <w:pPr>
-              <w:pStyle w:val="TableParagraph"/>
-              <w:spacing w:before="87"/>
-              <w:rPr>
-                <w:rFonts w:asciiTheme="minorHAnsi" w:hAnsiTheme="minorHAnsi"/>
-                <w:sz w:val="18"/>
-              </w:rPr>
-            </w:pPr>
-            <w:r>
-              <w:rPr>
-                <w:rFonts w:asciiTheme="minorHAnsi" w:hAnsiTheme="minorHAnsi"/>
-                <w:sz w:val="18"/>
-              </w:rPr>
-              <w:t xml:space="preserve">DNS </w:t>
-            </w:r>
-            <w:r>
-              <w:rPr>
-                <w:rFonts w:asciiTheme="minorHAnsi" w:hAnsiTheme="minorHAnsi"/>
-                <w:spacing w:val="-2"/>
-                <w:sz w:val="18"/>
-              </w:rPr>
-              <w:t>server</w:t>
-            </w:r>
-          </w:p>
-        </w:tc>
-      </w:tr>
-      <w:tr>
-        <w:trPr>
-          <w:trHeight w:val="420"/>
-        </w:trPr>
-        <w:tc>
-          <w:tcPr>
-            <w:tcW w:w="3363" w:type="dxa"/>
-            <w:gridSpan w:val="2"/>
-            <w:tcBorders>
-              <w:top w:val="single" w:sz="6" w:space="0" w:color="BABABA"/>
-              <w:left w:val="single" w:sz="6" w:space="0" w:color="FFFFFF"/>
-              <w:bottom w:val="single" w:sz="6" w:space="0" w:color="FFFFFF"/>
-              <w:right w:val="single" w:sz="6" w:space="0" w:color="FFFFFF"/>
-            </w:tcBorders>
-          </w:tcPr>
-          <w:p>
-            <w:pPr>
-              <w:pStyle w:val="TableParagraph"/>
-              <w:spacing w:before="87"/>
-              <w:rPr>
-                <w:rFonts w:asciiTheme="minorHAnsi" w:hAnsiTheme="minorHAnsi"/>
-                <w:sz w:val="18"/>
-              </w:rPr>
-            </w:pPr>
-            <w:r>
-              <w:rPr>
-                <w:rFonts w:asciiTheme="minorHAnsi" w:hAnsiTheme="minorHAnsi"/>
-                <w:sz w:val="18"/>
-              </w:rPr>
-              <w:t>MAC/physical</w:t>
-            </w:r>
-            <w:r>
-              <w:rPr>
-                <w:rFonts w:asciiTheme="minorHAnsi" w:hAnsiTheme="minorHAnsi"/>
-                <w:spacing w:val="-4"/>
-                <w:sz w:val="18"/>
-              </w:rPr>
-              <w:t xml:space="preserve"> </w:t>
-            </w:r>
-            <w:r>
-              <w:rPr>
-                <w:rFonts w:asciiTheme="minorHAnsi" w:hAnsiTheme="minorHAnsi"/>
-                <w:spacing w:val="-2"/>
-                <w:sz w:val="18"/>
-              </w:rPr>
-              <w:t>address</w:t>
-            </w:r>
-          </w:p>
-        </w:tc>
-      </w:tr>
-    </w:tbl>
-    <w:p>
-      <w:pPr>
-        <w:pStyle w:val="Heading2"/>
-        <w:rPr>
-          <w:b/>
           <w:bCs/>
         </w:rPr>
       </w:pPr>
       <w:r>
         <w:rPr>
+          <w:bCs/>
           <w:noProof/>
         </w:rPr>
         <w:drawing>
-          <wp:anchor distT="0" distB="0" distL="114300" distR="114300" simplePos="0" relativeHeight="251682816" behindDoc="0" locked="0" layoutInCell="1" allowOverlap="1" wp14:anchorId="0B331495" wp14:editId="5FD9E680">
+          <wp:anchor distT="0" distB="0" distL="114300" distR="114300" simplePos="0" relativeHeight="251680768" behindDoc="0" locked="0" layoutInCell="1" allowOverlap="1" wp14:anchorId="18E6A96C" wp14:editId="0AF79E7A">
             <wp:simplePos x="0" y="0"/>
             <wp:positionH relativeFrom="margin">
-              <wp:align>right</wp:align>
+              <wp:align>left</wp:align>
             </wp:positionH>
             <wp:positionV relativeFrom="paragraph">
-              <wp:posOffset>408940</wp:posOffset>
+              <wp:posOffset>3304540</wp:posOffset>
             </wp:positionV>
             <wp:extent cx="5731510" cy="3223895"/>
             <wp:effectExtent l="0" t="0" r="2540" b="0"/>
             <wp:wrapNone/>
-            <wp:docPr id="1061133283" name="Picture 3"/>
+            <wp:docPr id="336384272" name="Picture 15"/>
             <wp:cNvGraphicFramePr>
               <a:graphicFrameLocks xmlns:a="http://schemas.openxmlformats.org/drawingml/2006/main" noChangeAspect="1"/>
             </wp:cNvGraphicFramePr>
@@ -2420,7 +1388,7 @@
               <a:graphicData uri="http://schemas.openxmlformats.org/drawingml/2006/picture">
                 <pic:pic xmlns:pic="http://schemas.openxmlformats.org/drawingml/2006/picture">
                   <pic:nvPicPr>
-                    <pic:cNvPr id="1061133283" name="Picture 1061133283"/>
+                    <pic:cNvPr id="336384272" name="Picture 336384272"/>
                     <pic:cNvPicPr/>
                   </pic:nvPicPr>
                   <pic:blipFill>
@@ -2450,12 +1418,188 @@
           </wp:anchor>
         </w:drawing>
       </w:r>
-      <w:r>
+      <w:proofErr w:type="spellStart"/>
+      <w:r>
+        <w:rPr>
+          <w:bCs/>
+        </w:rPr>
+        <w:t>m</w:t>
+      </w:r>
+      <w:r>
+        <w:rPr>
+          <w:bCs/>
+        </w:rPr>
+        <w:t>kdir</w:t>
+      </w:r>
+      <w:proofErr w:type="spellEnd"/>
+      <w:r>
+        <w:rPr>
+          <w:bCs/>
+        </w:rPr>
+        <w:t xml:space="preserve"> Lab11_Git</w:t>
+      </w:r>
+      <w:r>
+        <w:rPr>
+          <w:bCs/>
+        </w:rPr>
+        <w:br/>
+      </w:r>
+      <w:r>
+        <w:rPr>
+          <w:bCs/>
+        </w:rPr>
+        <w:t>cd Lab11_Git</w:t>
+      </w:r>
+      <w:r>
+        <w:rPr>
+          <w:bCs/>
+        </w:rPr>
+        <w:br/>
+      </w:r>
+      <w:r>
+        <w:rPr>
+          <w:bCs/>
+        </w:rPr>
+        <w:t># Copy storage_estimator.py into this folder</w:t>
+      </w:r>
+      <w:r>
+        <w:rPr>
+          <w:bCs/>
+        </w:rPr>
+        <w:br/>
+      </w:r>
+      <w:r>
+        <w:rPr>
+          <w:bCs/>
+        </w:rPr>
+        <w:t xml:space="preserve">git </w:t>
+      </w:r>
+      <w:proofErr w:type="spellStart"/>
+      <w:r>
+        <w:rPr>
+          <w:bCs/>
+        </w:rPr>
+        <w:t>init</w:t>
+      </w:r>
+      <w:proofErr w:type="spellEnd"/>
+      <w:r>
+        <w:rPr>
+          <w:bCs/>
+        </w:rPr>
+        <w:br/>
+      </w:r>
+      <w:r>
+        <w:rPr>
+          <w:bCs/>
+        </w:rPr>
+        <w:t>git status</w:t>
+      </w:r>
+      <w:r>
+        <w:rPr>
+          <w:bCs/>
+        </w:rPr>
+        <w:br/>
+      </w:r>
+      <w:r>
+        <w:rPr>
+          <w:bCs/>
+        </w:rPr>
+        <w:t>If your instructor asks you to configure your Git identity, use your real academic name and email:</w:t>
+      </w:r>
+      <w:r>
+        <w:rPr>
+          <w:bCs/>
+        </w:rPr>
+        <w:br/>
+      </w:r>
+      <w:r>
+        <w:rPr>
+          <w:bCs/>
+        </w:rPr>
+        <w:t>git config --global user.name "Your Name"</w:t>
+      </w:r>
+      <w:r>
+        <w:rPr>
+          <w:bCs/>
+        </w:rPr>
+        <w:br/>
+      </w:r>
+      <w:r>
+        <w:rPr>
+          <w:bCs/>
+        </w:rPr>
+        <w:t>Stage your Python file and inspect the status before committing:</w:t>
+      </w:r>
+      <w:r>
+        <w:rPr>
+          <w:bCs/>
+        </w:rPr>
+        <w:br/>
+      </w:r>
+      <w:r>
+        <w:rPr>
+          <w:bCs/>
+        </w:rPr>
+        <w:t>git add storage_estimator.py</w:t>
+      </w:r>
+      <w:r>
+        <w:rPr>
+          <w:bCs/>
+        </w:rPr>
+        <w:br/>
+      </w:r>
+      <w:r>
+        <w:rPr>
+          <w:bCs/>
+        </w:rPr>
+        <w:t>git status</w:t>
+      </w:r>
+      <w:r>
+        <w:rPr>
+          <w:bCs/>
+        </w:rPr>
+        <w:br/>
+      </w:r>
+      <w:r>
+        <w:rPr>
+          <w:bCs/>
+        </w:rPr>
+        <w:t>Create the first commit:</w:t>
+      </w:r>
+      <w:r>
+        <w:rPr>
+          <w:bCs/>
+        </w:rPr>
+        <w:br/>
+      </w:r>
+      <w:r>
+        <w:rPr>
+          <w:bCs/>
+        </w:rPr>
+        <w:t>git commit -m "A</w:t>
+      </w:r>
+    </w:p>
+    <w:p>
+      <w:pPr>
+        <w:pStyle w:val="Heading2"/>
         <w:rPr>
           <w:b/>
           <w:bCs/>
         </w:rPr>
-        <w:t>Output Screenshot:</w:t>
+      </w:pPr>
+      <w:r>
+        <w:rPr>
+          <w:b/>
+          <w:bCs/>
+        </w:rPr>
+        <w:t>Screenshot</w:t>
+      </w:r>
+      <w:r>
+        <w:rPr>
+          <w:b/>
+          <w:bCs/>
+        </w:rPr>
+        <w:t>:</w:t>
       </w:r>
     </w:p>
     <w:p/>
@@ -2467,38 +1611,146 @@
     <w:p/>
     <w:p/>
     <w:p/>
+    <w:p/>
     <w:p>
       <w:pPr>
-        <w:ind w:firstLine="720"/>
+        <w:tabs>
+          <w:tab w:val="left" w:pos="900"/>
+        </w:tabs>
+        <w:rPr>
+          <w:rFonts w:asciiTheme="majorHAnsi" w:eastAsiaTheme="majorEastAsia" w:hAnsiTheme="majorHAnsi" w:cstheme="majorBidi"/>
+          <w:b/>
+          <w:bCs/>
+          <w:color w:val="0F4761" w:themeColor="accent1" w:themeShade="BF"/>
+          <w:sz w:val="32"/>
+          <w:szCs w:val="32"/>
+        </w:rPr>
       </w:pPr>
     </w:p>
     <w:p>
       <w:pPr>
-        <w:ind w:firstLine="720"/>
-      </w:pPr>
+        <w:pStyle w:val="Heading2"/>
+        <w:rPr>
+          <w:b/>
+          <w:bCs/>
+        </w:rPr>
+      </w:pPr>
+      <w:r>
+        <w:rPr>
+          <w:b/>
+          <w:bCs/>
+        </w:rPr>
+        <w:t>Task 2:</w:t>
+      </w:r>
     </w:p>
     <w:p>
-      <w:pPr>
-        <w:ind w:firstLine="720"/>
-      </w:pPr>
+      <w:r>
+        <w:t xml:space="preserve">Improve the Python file in one small meaningful way. Save it, then inspect the change before staging: </w:t>
+      </w:r>
+    </w:p>
+    <w:p>
+      <w:pPr>
+        <w:pStyle w:val="ListParagraph"/>
+        <w:numPr>
+          <w:ilvl w:val="0"/>
+          <w:numId w:val="18"/>
+        </w:numPr>
+      </w:pPr>
+      <w:r>
+        <w:t xml:space="preserve">git status </w:t>
+      </w:r>
+    </w:p>
+    <w:p>
+      <w:pPr>
+        <w:pStyle w:val="ListParagraph"/>
+        <w:numPr>
+          <w:ilvl w:val="0"/>
+          <w:numId w:val="18"/>
+        </w:numPr>
+      </w:pPr>
+      <w:r>
+        <w:t xml:space="preserve">git diff </w:t>
+      </w:r>
+    </w:p>
+    <w:p>
+      <w:pPr>
+        <w:pStyle w:val="ListParagraph"/>
+        <w:numPr>
+          <w:ilvl w:val="0"/>
+          <w:numId w:val="18"/>
+        </w:numPr>
+      </w:pPr>
+      <w:r>
+        <w:t xml:space="preserve">Now stage and commit the improvement: </w:t>
+      </w:r>
+    </w:p>
+    <w:p>
+      <w:pPr>
+        <w:pStyle w:val="ListParagraph"/>
+        <w:numPr>
+          <w:ilvl w:val="0"/>
+          <w:numId w:val="18"/>
+        </w:numPr>
+      </w:pPr>
+      <w:r>
+        <w:lastRenderedPageBreak/>
+        <w:t xml:space="preserve">git add storage_estimator.py git commit -m "Improve storage estimator output" </w:t>
+      </w:r>
+    </w:p>
+    <w:p>
+      <w:pPr>
+        <w:pStyle w:val="ListParagraph"/>
+        <w:numPr>
+          <w:ilvl w:val="0"/>
+          <w:numId w:val="18"/>
+        </w:numPr>
+      </w:pPr>
+      <w:r>
+        <w:t xml:space="preserve">git log </w:t>
+      </w:r>
+      <w:r>
+        <w:t>–</w:t>
+      </w:r>
+      <w:proofErr w:type="spellStart"/>
+      <w:r>
+        <w:t>oneline</w:t>
+      </w:r>
+      <w:proofErr w:type="spellEnd"/>
+    </w:p>
+    <w:p>
+      <w:pPr>
+        <w:pStyle w:val="Heading2"/>
+        <w:rPr>
+          <w:b/>
+          <w:bCs/>
+        </w:rPr>
+      </w:pPr>
+      <w:r>
+        <w:rPr>
+          <w:b/>
+          <w:bCs/>
+        </w:rPr>
+        <w:t>Screenshot:</w:t>
+      </w:r>
+    </w:p>
+    <w:p>
       <w:r>
         <w:rPr>
           <w:noProof/>
         </w:rPr>
-        <w:lastRenderedPageBreak/>
         <w:drawing>
-          <wp:anchor distT="0" distB="0" distL="114300" distR="114300" simplePos="0" relativeHeight="251683840" behindDoc="0" locked="0" layoutInCell="1" allowOverlap="1" wp14:anchorId="21E757C6" wp14:editId="5677D03F">
+          <wp:anchor distT="0" distB="0" distL="114300" distR="114300" simplePos="0" relativeHeight="251681792" behindDoc="0" locked="0" layoutInCell="1" allowOverlap="1" wp14:anchorId="3922944D" wp14:editId="2F4D393A">
             <wp:simplePos x="0" y="0"/>
-            <wp:positionH relativeFrom="margin">
-              <wp:align>left</wp:align>
+            <wp:positionH relativeFrom="column">
+              <wp:posOffset>0</wp:posOffset>
             </wp:positionH>
             <wp:positionV relativeFrom="paragraph">
-              <wp:posOffset>-7620</wp:posOffset>
+              <wp:posOffset>-1270</wp:posOffset>
             </wp:positionV>
             <wp:extent cx="5731510" cy="3223895"/>
             <wp:effectExtent l="0" t="0" r="2540" b="0"/>
             <wp:wrapNone/>
-            <wp:docPr id="1045626297" name="Picture 4"/>
+            <wp:docPr id="67990733" name="Picture 16"/>
             <wp:cNvGraphicFramePr>
               <a:graphicFrameLocks xmlns:a="http://schemas.openxmlformats.org/drawingml/2006/main" noChangeAspect="1"/>
             </wp:cNvGraphicFramePr>
@@ -2506,7 +1758,7 @@
               <a:graphicData uri="http://schemas.openxmlformats.org/drawingml/2006/picture">
                 <pic:pic xmlns:pic="http://schemas.openxmlformats.org/drawingml/2006/picture">
                   <pic:nvPicPr>
-                    <pic:cNvPr id="1045626297" name="Picture 1045626297"/>
+                    <pic:cNvPr id="67990733" name="Picture 67990733"/>
                     <pic:cNvPicPr/>
                   </pic:nvPicPr>
                   <pic:blipFill>
@@ -2546,70 +1798,8 @@
     <w:p/>
     <w:p/>
     <w:p/>
-    <w:p>
-      <w:pPr>
-        <w:rPr>
-          <w:b/>
-          <w:bCs/>
-        </w:rPr>
-      </w:pPr>
-    </w:p>
-    <w:p>
-      <w:pPr>
-        <w:pStyle w:val="Heading2"/>
-      </w:pPr>
-      <w:r>
-        <w:rPr>
-          <w:b/>
-          <w:bCs/>
-        </w:rPr>
-        <w:t>Think</w:t>
-      </w:r>
-    </w:p>
-    <w:p>
-      <w:r>
-        <w:t>Which value tells you:</w:t>
-      </w:r>
-    </w:p>
-    <w:p>
-      <w:pPr>
-        <w:pStyle w:val="Heading3"/>
-      </w:pPr>
-      <w:r>
-        <w:t>Your logical address on the IP network?</w:t>
-      </w:r>
-    </w:p>
-    <w:p>
-      <w:r>
-        <w:t>IP address such as IPV4 or IPV6 address tells us about the logical address of device on network.</w:t>
-      </w:r>
-    </w:p>
-    <w:p>
-      <w:pPr>
-        <w:pStyle w:val="Heading3"/>
-      </w:pPr>
-      <w:r>
-        <w:t>The address of your network interface?</w:t>
-      </w:r>
-    </w:p>
-    <w:p>
-      <w:r>
-        <w:t>MAC Address refers to the unique identifier of the hardware / Network interface card over a network that uniquely identifies each device. It remains constant.</w:t>
-      </w:r>
-    </w:p>
-    <w:p>
-      <w:pPr>
-        <w:pStyle w:val="Heading3"/>
-      </w:pPr>
-      <w:r>
-        <w:t>Where traffic normally goes when the destination is outside your local network?</w:t>
-      </w:r>
-    </w:p>
-    <w:p>
-      <w:r>
-        <w:t>Default Gateway or Gateway address. When destination is outside the local network the traffic goes through this address.</w:t>
-      </w:r>
-    </w:p>
+    <w:p/>
+    <w:p/>
     <w:p>
       <w:pPr>
         <w:pStyle w:val="Heading2"/>
@@ -2623,283 +1813,171 @@
           <w:b/>
           <w:bCs/>
         </w:rPr>
-        <w:t>Task 2:</w:t>
+        <w:t>Task 3:</w:t>
       </w:r>
     </w:p>
     <w:p>
-      <w:pPr>
-        <w:pStyle w:val="Heading3"/>
-      </w:pPr>
-      <w:r>
-        <w:t>Test 1 — Loopback</w:t>
+      <w:r>
+        <w:t xml:space="preserve">Create README.md containing: project title, purpose, how to run the program, example input/output, and author/group information as instructed. </w:t>
       </w:r>
     </w:p>
     <w:p>
-      <w:r>
+      <w:pPr>
+        <w:pStyle w:val="ListParagraph"/>
+        <w:numPr>
+          <w:ilvl w:val="0"/>
+          <w:numId w:val="19"/>
+        </w:numPr>
+      </w:pPr>
+      <w:proofErr w:type="gramStart"/>
+      <w:r>
+        <w:t>Create .</w:t>
+      </w:r>
+      <w:proofErr w:type="spellStart"/>
+      <w:r>
+        <w:t>gitignore</w:t>
+      </w:r>
+      <w:proofErr w:type="spellEnd"/>
+      <w:proofErr w:type="gramEnd"/>
+      <w:r>
+        <w:t xml:space="preserve"> with common Python-generated files, </w:t>
+      </w:r>
+    </w:p>
+    <w:p>
+      <w:pPr>
+        <w:pStyle w:val="ListParagraph"/>
+        <w:numPr>
+          <w:ilvl w:val="0"/>
+          <w:numId w:val="19"/>
+        </w:numPr>
+      </w:pPr>
+      <w:r>
+        <w:t>for example: __</w:t>
+      </w:r>
+      <w:proofErr w:type="spellStart"/>
+      <w:r>
+        <w:t>pycache</w:t>
+      </w:r>
+      <w:proofErr w:type="spellEnd"/>
+      <w:r>
+        <w:t>__/</w:t>
+      </w:r>
+    </w:p>
+    <w:p>
+      <w:pPr>
+        <w:pStyle w:val="ListParagraph"/>
+        <w:numPr>
+          <w:ilvl w:val="0"/>
+          <w:numId w:val="19"/>
+        </w:numPr>
+      </w:pPr>
+      <w:proofErr w:type="gramStart"/>
+      <w:r>
+        <w:t>*.</w:t>
+      </w:r>
+      <w:proofErr w:type="spellStart"/>
+      <w:r>
+        <w:t>pyc</w:t>
+      </w:r>
+      <w:proofErr w:type="spellEnd"/>
+      <w:r>
+        <w:t xml:space="preserve"> .</w:t>
+      </w:r>
+      <w:proofErr w:type="spellStart"/>
+      <w:r>
+        <w:t>venv</w:t>
+      </w:r>
+      <w:proofErr w:type="spellEnd"/>
+      <w:proofErr w:type="gramEnd"/>
+      <w:r>
+        <w:t xml:space="preserve">/ </w:t>
+      </w:r>
+      <w:proofErr w:type="spellStart"/>
+      <w:r>
+        <w:t>venv</w:t>
+      </w:r>
+      <w:proofErr w:type="spellEnd"/>
+      <w:r>
+        <w:t xml:space="preserve">/ </w:t>
+      </w:r>
+    </w:p>
+    <w:p>
+      <w:pPr>
+        <w:pStyle w:val="ListParagraph"/>
+        <w:numPr>
+          <w:ilvl w:val="0"/>
+          <w:numId w:val="19"/>
+        </w:numPr>
+      </w:pPr>
+      <w:r>
+        <w:t xml:space="preserve">git add </w:t>
+      </w:r>
+      <w:proofErr w:type="gramStart"/>
+      <w:r>
+        <w:t>README.md .</w:t>
+      </w:r>
+      <w:proofErr w:type="spellStart"/>
+      <w:r>
+        <w:t>gitignore</w:t>
+      </w:r>
+      <w:proofErr w:type="spellEnd"/>
+      <w:proofErr w:type="gramEnd"/>
+      <w:r>
+        <w:t xml:space="preserve"> </w:t>
+      </w:r>
+    </w:p>
+    <w:p>
+      <w:pPr>
+        <w:pStyle w:val="ListParagraph"/>
+        <w:numPr>
+          <w:ilvl w:val="0"/>
+          <w:numId w:val="19"/>
+        </w:numPr>
+      </w:pPr>
+      <w:r>
+        <w:t>git commit -m "Add project documentation and ignore rules"</w:t>
+      </w:r>
+    </w:p>
+    <w:p>
+      <w:pPr>
+        <w:pStyle w:val="Heading2"/>
         <w:rPr>
-          <w:noProof/>
+          <w:b/>
+          <w:bCs/>
         </w:rPr>
-        <mc:AlternateContent>
-          <mc:Choice Requires="wps">
-            <w:drawing>
-              <wp:anchor distT="0" distB="0" distL="114300" distR="114300" simplePos="0" relativeHeight="251685888" behindDoc="0" locked="0" layoutInCell="1" allowOverlap="1" wp14:anchorId="6ED3E203" wp14:editId="2AD5B15A">
-                <wp:simplePos x="0" y="0"/>
-                <wp:positionH relativeFrom="margin">
-                  <wp:align>left</wp:align>
-                </wp:positionH>
-                <wp:positionV relativeFrom="paragraph">
-                  <wp:posOffset>225425</wp:posOffset>
-                </wp:positionV>
-                <wp:extent cx="5791200" cy="419100"/>
-                <wp:effectExtent l="0" t="0" r="19050" b="19050"/>
-                <wp:wrapNone/>
-                <wp:docPr id="34" name="Textbox 34"/>
-                <wp:cNvGraphicFramePr/>
-                <a:graphic xmlns:a="http://schemas.openxmlformats.org/drawingml/2006/main">
-                  <a:graphicData uri="http://schemas.microsoft.com/office/word/2010/wordprocessingShape">
-                    <wps:wsp>
-                      <wps:cNvSpPr txBox="1"/>
-                      <wps:spPr>
-                        <a:xfrm>
-                          <a:off x="0" y="0"/>
-                          <a:ext cx="5791200" cy="419100"/>
-                        </a:xfrm>
-                        <a:prstGeom prst="rect">
-                          <a:avLst/>
-                        </a:prstGeom>
-                        <a:ln>
-                          <a:solidFill>
-                            <a:schemeClr val="tx1"/>
-                          </a:solidFill>
-                        </a:ln>
-                      </wps:spPr>
-                      <wps:txbx>
-                        <w:txbxContent>
-                          <w:p>
-                            <w:pPr>
-                              <w:spacing w:before="242"/>
-                              <w:ind w:left="194"/>
-                              <w:rPr>
-                                <w:rFonts w:ascii="Courier New"/>
-                                <w:sz w:val="18"/>
-                              </w:rPr>
-                            </w:pPr>
-                            <w:r>
-                              <w:rPr>
-                                <w:rFonts w:ascii="Courier New"/>
-                                <w:sz w:val="18"/>
-                              </w:rPr>
-                              <w:t xml:space="preserve">ping </w:t>
-                            </w:r>
-                            <w:r>
-                              <w:rPr>
-                                <w:rFonts w:ascii="Courier New"/>
-                                <w:spacing w:val="-2"/>
-                                <w:sz w:val="18"/>
-                              </w:rPr>
-                              <w:t>127.0.0.1</w:t>
-                            </w:r>
-                          </w:p>
-                        </w:txbxContent>
-                      </wps:txbx>
-                      <wps:bodyPr wrap="square" lIns="0" tIns="0" rIns="0" bIns="0" rtlCol="0">
-                        <a:noAutofit/>
-                      </wps:bodyPr>
-                    </wps:wsp>
-                  </a:graphicData>
-                </a:graphic>
-              </wp:anchor>
-            </w:drawing>
-          </mc:Choice>
-          <mc:Fallback>
-            <w:pict>
-              <v:shape w14:anchorId="6ED3E203" id="Textbox 34" o:spid="_x0000_s1034" type="#_x0000_t202" style="position:absolute;margin-left:0;margin-top:17.75pt;width:456pt;height:33pt;z-index:251685888;visibility:visible;mso-wrap-style:square;mso-wrap-distance-left:9pt;mso-wrap-distance-top:0;mso-wrap-distance-right:9pt;mso-wrap-distance-bottom:0;mso-position-horizontal:left;mso-position-horizontal-relative:margin;mso-position-vertical:absolute;mso-position-vertical-relative:text;v-text-anchor:top" o:gfxdata="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" filled="f" strokecolor="black [3213]">
-                <v:textbox inset="0,0,0,0">
-                  <w:txbxContent>
-                    <w:p>
-                      <w:pPr>
-                        <w:spacing w:before="242"/>
-                        <w:ind w:left="194"/>
-                        <w:rPr>
-                          <w:rFonts w:ascii="Courier New"/>
-                          <w:sz w:val="18"/>
-                        </w:rPr>
-                      </w:pPr>
-                      <w:r>
-                        <w:rPr>
-                          <w:rFonts w:ascii="Courier New"/>
-                          <w:sz w:val="18"/>
-                        </w:rPr>
-                        <w:t xml:space="preserve">ping </w:t>
-                      </w:r>
-                      <w:r>
-                        <w:rPr>
-                          <w:rFonts w:ascii="Courier New"/>
-                          <w:spacing w:val="-2"/>
-                          <w:sz w:val="18"/>
-                        </w:rPr>
-                        <w:t>127.0.0.1</w:t>
-                      </w:r>
-                    </w:p>
-                  </w:txbxContent>
-                </v:textbox>
-                <w10:wrap anchorx="margin"/>
-              </v:shape>
-            </w:pict>
-          </mc:Fallback>
-        </mc:AlternateContent>
-      </w:r>
-      <w:r>
-        <w:t>Windows:</w:t>
+      </w:pPr>
+      <w:r>
+        <w:rPr>
+          <w:b/>
+          <w:bCs/>
+        </w:rPr>
+        <w:t>Screenshot:</w:t>
       </w:r>
     </w:p>
     <w:p/>
     <w:p/>
-    <w:p>
-      <w:r>
-        <w:t>Ubuntu:</w:t>
-      </w:r>
-    </w:p>
+    <w:p/>
+    <w:p/>
+    <w:p/>
     <w:p>
       <w:r>
         <w:rPr>
           <w:noProof/>
         </w:rPr>
         <w:lastRenderedPageBreak/>
-        <mc:AlternateContent>
-          <mc:Choice Requires="wps">
-            <w:drawing>
-              <wp:anchor distT="0" distB="0" distL="114300" distR="114300" simplePos="0" relativeHeight="251687936" behindDoc="0" locked="0" layoutInCell="1" allowOverlap="1" wp14:anchorId="50174544" wp14:editId="60FC0187">
-                <wp:simplePos x="0" y="0"/>
-                <wp:positionH relativeFrom="column">
-                  <wp:posOffset>0</wp:posOffset>
-                </wp:positionH>
-                <wp:positionV relativeFrom="paragraph">
-                  <wp:posOffset>0</wp:posOffset>
-                </wp:positionV>
-                <wp:extent cx="5791200" cy="419100"/>
-                <wp:effectExtent l="0" t="0" r="19050" b="19050"/>
-                <wp:wrapNone/>
-                <wp:docPr id="37" name="Textbox 37"/>
-                <wp:cNvGraphicFramePr/>
-                <a:graphic xmlns:a="http://schemas.openxmlformats.org/drawingml/2006/main">
-                  <a:graphicData uri="http://schemas.microsoft.com/office/word/2010/wordprocessingShape">
-                    <wps:wsp>
-                      <wps:cNvSpPr txBox="1"/>
-                      <wps:spPr>
-                        <a:xfrm>
-                          <a:off x="0" y="0"/>
-                          <a:ext cx="5791200" cy="419100"/>
-                        </a:xfrm>
-                        <a:prstGeom prst="rect">
-                          <a:avLst/>
-                        </a:prstGeom>
-                        <a:ln>
-                          <a:solidFill>
-                            <a:schemeClr val="tx1"/>
-                          </a:solidFill>
-                        </a:ln>
-                      </wps:spPr>
-                      <wps:txbx>
-                        <w:txbxContent>
-                          <w:p>
-                            <w:pPr>
-                              <w:spacing w:before="242"/>
-                              <w:ind w:left="194"/>
-                              <w:rPr>
-                                <w:rFonts w:ascii="Courier New"/>
-                                <w:sz w:val="18"/>
-                              </w:rPr>
-                            </w:pPr>
-                            <w:r>
-                              <w:rPr>
-                                <w:rFonts w:ascii="Courier New"/>
-                                <w:sz w:val="18"/>
-                              </w:rPr>
-                              <w:t xml:space="preserve">ping -c 4 </w:t>
-                            </w:r>
-                            <w:r>
-                              <w:rPr>
-                                <w:rFonts w:ascii="Courier New"/>
-                                <w:spacing w:val="-2"/>
-                                <w:sz w:val="18"/>
-                              </w:rPr>
-                              <w:t>127.0.0.1</w:t>
-                            </w:r>
-                          </w:p>
-                        </w:txbxContent>
-                      </wps:txbx>
-                      <wps:bodyPr wrap="square" lIns="0" tIns="0" rIns="0" bIns="0" rtlCol="0">
-                        <a:noAutofit/>
-                      </wps:bodyPr>
-                    </wps:wsp>
-                  </a:graphicData>
-                </a:graphic>
-              </wp:anchor>
-            </w:drawing>
-          </mc:Choice>
-          <mc:Fallback>
-            <w:pict>
-              <v:shape w14:anchorId="50174544" id="Textbox 37" o:spid="_x0000_s1035" type="#_x0000_t202" style="position:absolute;margin-left:0;margin-top:0;width:456pt;height:33pt;z-index:251687936;visibility:visible;mso-wrap-style:square;mso-wrap-distance-left:9pt;mso-wrap-distance-top:0;mso-wrap-distance-right:9pt;mso-wrap-distance-bottom:0;mso-position-horizontal:absolute;mso-position-horizontal-relative:text;mso-position-vertical:absolute;mso-position-vertical-relative:text;v-text-anchor:top" o:gfxdata="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" filled="f" strokecolor="black [3213]">
-                <v:textbox inset="0,0,0,0">
-                  <w:txbxContent>
-                    <w:p>
-                      <w:pPr>
-                        <w:spacing w:before="242"/>
-                        <w:ind w:left="194"/>
-                        <w:rPr>
-                          <w:rFonts w:ascii="Courier New"/>
-                          <w:sz w:val="18"/>
-                        </w:rPr>
-                      </w:pPr>
-                      <w:r>
-                        <w:rPr>
-                          <w:rFonts w:ascii="Courier New"/>
-                          <w:sz w:val="18"/>
-                        </w:rPr>
-                        <w:t xml:space="preserve">ping -c 4 </w:t>
-                      </w:r>
-                      <w:r>
-                        <w:rPr>
-                          <w:rFonts w:ascii="Courier New"/>
-                          <w:spacing w:val="-2"/>
-                          <w:sz w:val="18"/>
-                        </w:rPr>
-                        <w:t>127.0.0.1</w:t>
-                      </w:r>
-                    </w:p>
-                  </w:txbxContent>
-                </v:textbox>
-              </v:shape>
-            </w:pict>
-          </mc:Fallback>
-        </mc:AlternateContent>
-      </w:r>
-    </w:p>
-    <w:p/>
-    <w:p>
-      <w:r>
-        <w:t>Prediction:</w:t>
-      </w:r>
-    </w:p>
-    <w:p>
-      <w:r>
-        <w:rPr>
-          <w:noProof/>
-        </w:rPr>
         <w:drawing>
-          <wp:anchor distT="0" distB="0" distL="114300" distR="114300" simplePos="0" relativeHeight="251688960" behindDoc="0" locked="0" layoutInCell="1" allowOverlap="1" wp14:anchorId="63B5C814" wp14:editId="30A7BADE">
+          <wp:anchor distT="0" distB="0" distL="114300" distR="114300" simplePos="0" relativeHeight="251682816" behindDoc="0" locked="0" layoutInCell="1" allowOverlap="1" wp14:anchorId="73EBAF50" wp14:editId="59AE2534">
             <wp:simplePos x="0" y="0"/>
             <wp:positionH relativeFrom="column">
               <wp:posOffset>0</wp:posOffset>
             </wp:positionH>
             <wp:positionV relativeFrom="paragraph">
-              <wp:posOffset>1270</wp:posOffset>
+              <wp:posOffset>1616</wp:posOffset>
             </wp:positionV>
             <wp:extent cx="5731510" cy="3223895"/>
             <wp:effectExtent l="0" t="0" r="2540" b="0"/>
             <wp:wrapNone/>
-            <wp:docPr id="2064707388" name="Picture 5"/>
+            <wp:docPr id="1884964666" name="Picture 17"/>
             <wp:cNvGraphicFramePr>
               <a:graphicFrameLocks xmlns:a="http://schemas.openxmlformats.org/drawingml/2006/main" noChangeAspect="1"/>
             </wp:cNvGraphicFramePr>
@@ -2907,7 +1985,7 @@
               <a:graphicData uri="http://schemas.openxmlformats.org/drawingml/2006/picture">
                 <pic:pic xmlns:pic="http://schemas.openxmlformats.org/drawingml/2006/picture">
                   <pic:nvPicPr>
-                    <pic:cNvPr id="2064707388" name="Picture 2064707388"/>
+                    <pic:cNvPr id="1884964666" name="Picture 1884964666"/>
                     <pic:cNvPicPr/>
                   </pic:nvPicPr>
                   <pic:blipFill>
@@ -2961,369 +2039,12 @@
           <w:b/>
           <w:bCs/>
         </w:rPr>
-        <w:t>Task 3:</w:t>
+        <w:t>Task 4:</w:t>
       </w:r>
     </w:p>
     <w:p>
-      <w:pPr>
-        <w:pStyle w:val="Heading3"/>
-      </w:pPr>
-      <w:r>
-        <w:t>DNS Lookup</w:t>
-      </w:r>
-    </w:p>
-    <w:p>
-      <w:r>
-        <w:rPr>
-          <w:noProof/>
-          <w:sz w:val="20"/>
-        </w:rPr>
-        <mc:AlternateContent>
-          <mc:Choice Requires="wpg">
-            <w:drawing>
-              <wp:anchor distT="0" distB="0" distL="0" distR="0" simplePos="0" relativeHeight="251691008" behindDoc="1" locked="0" layoutInCell="1" allowOverlap="1" wp14:anchorId="11FAE6F0" wp14:editId="2571ECB8">
-                <wp:simplePos x="0" y="0"/>
-                <wp:positionH relativeFrom="page">
-                  <wp:posOffset>914400</wp:posOffset>
-                </wp:positionH>
-                <wp:positionV relativeFrom="paragraph">
-                  <wp:posOffset>301625</wp:posOffset>
-                </wp:positionV>
-                <wp:extent cx="5791200" cy="419100"/>
-                <wp:effectExtent l="0" t="0" r="0" b="0"/>
-                <wp:wrapTopAndBottom/>
-                <wp:docPr id="54" name="Group 54"/>
-                <wp:cNvGraphicFramePr>
-                  <a:graphicFrameLocks xmlns:a="http://schemas.openxmlformats.org/drawingml/2006/main"/>
-                </wp:cNvGraphicFramePr>
-                <a:graphic xmlns:a="http://schemas.openxmlformats.org/drawingml/2006/main">
-                  <a:graphicData uri="http://schemas.microsoft.com/office/word/2010/wordprocessingGroup">
-                    <wpg:wgp>
-                      <wpg:cNvGrpSpPr>
-                        <a:grpSpLocks/>
-                      </wpg:cNvGrpSpPr>
-                      <wpg:grpSpPr>
-                        <a:xfrm>
-                          <a:off x="0" y="0"/>
-                          <a:ext cx="5791200" cy="419100"/>
-                          <a:chOff x="0" y="0"/>
-                          <a:chExt cx="5791200" cy="419100"/>
-                        </a:xfrm>
-                      </wpg:grpSpPr>
-                      <wps:wsp>
-                        <wps:cNvPr id="55" name="Graphic 55"/>
-                        <wps:cNvSpPr/>
-                        <wps:spPr>
-                          <a:xfrm>
-                            <a:off x="0" y="0"/>
-                            <a:ext cx="5791200" cy="419100"/>
-                          </a:xfrm>
-                          <a:custGeom>
-                            <a:avLst/>
-                            <a:gdLst/>
-                            <a:ahLst/>
-                            <a:cxnLst/>
-                            <a:rect l="l" t="t" r="r" b="b"/>
-                            <a:pathLst>
-                              <a:path w="5791200" h="419100">
-                                <a:moveTo>
-                                  <a:pt x="5753100" y="419100"/>
-                                </a:moveTo>
-                                <a:lnTo>
-                                  <a:pt x="38100" y="419100"/>
-                                </a:lnTo>
-                                <a:lnTo>
-                                  <a:pt x="23306" y="416093"/>
-                                </a:lnTo>
-                                <a:lnTo>
-                                  <a:pt x="11191" y="407908"/>
-                                </a:lnTo>
-                                <a:lnTo>
-                                  <a:pt x="3006" y="395793"/>
-                                </a:lnTo>
-                                <a:lnTo>
-                                  <a:pt x="0" y="381000"/>
-                                </a:lnTo>
-                                <a:lnTo>
-                                  <a:pt x="0" y="38100"/>
-                                </a:lnTo>
-                                <a:lnTo>
-                                  <a:pt x="3006" y="23306"/>
-                                </a:lnTo>
-                                <a:lnTo>
-                                  <a:pt x="11191" y="11191"/>
-                                </a:lnTo>
-                                <a:lnTo>
-                                  <a:pt x="23306" y="3006"/>
-                                </a:lnTo>
-                                <a:lnTo>
-                                  <a:pt x="38100" y="0"/>
-                                </a:lnTo>
-                                <a:lnTo>
-                                  <a:pt x="5753100" y="0"/>
-                                </a:lnTo>
-                                <a:lnTo>
-                                  <a:pt x="5767893" y="3006"/>
-                                </a:lnTo>
-                                <a:lnTo>
-                                  <a:pt x="5777541" y="9525"/>
-                                </a:lnTo>
-                                <a:lnTo>
-                                  <a:pt x="38100" y="9525"/>
-                                </a:lnTo>
-                                <a:lnTo>
-                                  <a:pt x="27004" y="11779"/>
-                                </a:lnTo>
-                                <a:lnTo>
-                                  <a:pt x="17918" y="17918"/>
-                                </a:lnTo>
-                                <a:lnTo>
-                                  <a:pt x="11779" y="27004"/>
-                                </a:lnTo>
-                                <a:lnTo>
-                                  <a:pt x="9525" y="38100"/>
-                                </a:lnTo>
-                                <a:lnTo>
-                                  <a:pt x="9525" y="381000"/>
-                                </a:lnTo>
-                                <a:lnTo>
-                                  <a:pt x="11779" y="392095"/>
-                                </a:lnTo>
-                                <a:lnTo>
-                                  <a:pt x="17918" y="401181"/>
-                                </a:lnTo>
-                                <a:lnTo>
-                                  <a:pt x="27004" y="407320"/>
-                                </a:lnTo>
-                                <a:lnTo>
-                                  <a:pt x="38100" y="409575"/>
-                                </a:lnTo>
-                                <a:lnTo>
-                                  <a:pt x="5777541" y="409575"/>
-                                </a:lnTo>
-                                <a:lnTo>
-                                  <a:pt x="5767893" y="416093"/>
-                                </a:lnTo>
-                                <a:lnTo>
-                                  <a:pt x="5753100" y="419100"/>
-                                </a:lnTo>
-                                <a:close/>
-                              </a:path>
-                              <a:path w="5791200" h="419100">
-                                <a:moveTo>
-                                  <a:pt x="5777541" y="409575"/>
-                                </a:moveTo>
-                                <a:lnTo>
-                                  <a:pt x="5753100" y="409575"/>
-                                </a:lnTo>
-                                <a:lnTo>
-                                  <a:pt x="5764195" y="407320"/>
-                                </a:lnTo>
-                                <a:lnTo>
-                                  <a:pt x="5773281" y="401181"/>
-                                </a:lnTo>
-                                <a:lnTo>
-                                  <a:pt x="5779420" y="392095"/>
-                                </a:lnTo>
-                                <a:lnTo>
-                                  <a:pt x="5781675" y="381000"/>
-                                </a:lnTo>
-                                <a:lnTo>
-                                  <a:pt x="5781675" y="38100"/>
-                                </a:lnTo>
-                                <a:lnTo>
-                                  <a:pt x="5779420" y="27004"/>
-                                </a:lnTo>
-                                <a:lnTo>
-                                  <a:pt x="5773281" y="17918"/>
-                                </a:lnTo>
-                                <a:lnTo>
-                                  <a:pt x="5764195" y="11779"/>
-                                </a:lnTo>
-                                <a:lnTo>
-                                  <a:pt x="5753100" y="9525"/>
-                                </a:lnTo>
-                                <a:lnTo>
-                                  <a:pt x="5777541" y="9525"/>
-                                </a:lnTo>
-                                <a:lnTo>
-                                  <a:pt x="5780008" y="11191"/>
-                                </a:lnTo>
-                                <a:lnTo>
-                                  <a:pt x="5788193" y="23306"/>
-                                </a:lnTo>
-                                <a:lnTo>
-                                  <a:pt x="5791200" y="38100"/>
-                                </a:lnTo>
-                                <a:lnTo>
-                                  <a:pt x="5791200" y="381000"/>
-                                </a:lnTo>
-                                <a:lnTo>
-                                  <a:pt x="5788193" y="395793"/>
-                                </a:lnTo>
-                                <a:lnTo>
-                                  <a:pt x="5780008" y="407908"/>
-                                </a:lnTo>
-                                <a:lnTo>
-                                  <a:pt x="5777541" y="409575"/>
-                                </a:lnTo>
-                                <a:close/>
-                              </a:path>
-                            </a:pathLst>
-                          </a:custGeom>
-                          <a:solidFill>
-                            <a:srgbClr val="BABABA"/>
-                          </a:solidFill>
-                        </wps:spPr>
-                        <wps:bodyPr wrap="square" lIns="0" tIns="0" rIns="0" bIns="0" rtlCol="0">
-                          <a:prstTxWarp prst="textNoShape">
-                            <a:avLst/>
-                          </a:prstTxWarp>
-                          <a:noAutofit/>
-                        </wps:bodyPr>
-                      </wps:wsp>
-                      <wps:wsp>
-                        <wps:cNvPr id="56" name="Textbox 56"/>
-                        <wps:cNvSpPr txBox="1"/>
-                        <wps:spPr>
-                          <a:xfrm>
-                            <a:off x="0" y="0"/>
-                            <a:ext cx="5791200" cy="419100"/>
-                          </a:xfrm>
-                          <a:prstGeom prst="rect">
-                            <a:avLst/>
-                          </a:prstGeom>
-                        </wps:spPr>
-                        <wps:txbx>
-                          <w:txbxContent>
-                            <w:p>
-                              <w:pPr>
-                                <w:spacing w:before="242"/>
-                                <w:ind w:left="194"/>
-                                <w:rPr>
-                                  <w:rFonts w:ascii="Courier New"/>
-                                  <w:sz w:val="18"/>
-                                </w:rPr>
-                              </w:pPr>
-                              <w:r>
-                                <w:rPr>
-                                  <w:rFonts w:ascii="Courier New"/>
-                                  <w:sz w:val="18"/>
-                                </w:rPr>
-                                <w:t>nslookup example.com</w:t>
-                              </w:r>
-                            </w:p>
-                          </w:txbxContent>
-                        </wps:txbx>
-                        <wps:bodyPr wrap="square" lIns="0" tIns="0" rIns="0" bIns="0" rtlCol="0">
-                          <a:noAutofit/>
-                        </wps:bodyPr>
-                      </wps:wsp>
-                    </wpg:wgp>
-                  </a:graphicData>
-                </a:graphic>
-              </wp:anchor>
-            </w:drawing>
-          </mc:Choice>
-          <mc:Fallback>
-            <w:pict>
-              <v:group w14:anchorId="11FAE6F0" id="Group 54" o:spid="_x0000_s1036" style="position:absolute;margin-left:1in;margin-top:23.75pt;width:456pt;height:33pt;z-index:-251625472;mso-wrap-distance-left:0;mso-wrap-distance-right:0;mso-position-horizontal-relative:page;mso-position-vertical-relative:text" coordsize="57912,4191" o:gfxdata="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">
-                <v:shape id="Graphic 55" o:spid="_x0000_s1037" style="position:absolute;width:57912;height:4191;visibility:visible;mso-wrap-style:square;v-text-anchor:top" coordsize="5791200,419100" o:gfxdata="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" path="m5753100,419100r-5715000,l23306,416093,11191,407908,3006,395793,,381000,,38100,3006,23306,11191,11191,23306,3006,38100,,5753100,r14793,3006l5777541,9525r-5739441,l27004,11779r-9086,6139l11779,27004,9525,38100r,342900l11779,392095r6139,9086l27004,407320r11096,2255l5777541,409575r-9648,6518l5753100,419100xem5777541,409575r-24441,l5764195,407320r9086,-6139l5779420,392095r2255,-11095l5781675,38100r-2255,-11096l5773281,17918r-9086,-6139l5753100,9525r24441,l5780008,11191r8185,12115l5791200,38100r,342900l5788193,395793r-8185,12115l5777541,409575xe" fillcolor="#bababa" stroked="f">
-                  <v:path arrowok="t"/>
-                </v:shape>
-                <v:shape id="Textbox 56" o:spid="_x0000_s1038" type="#_x0000_t202" style="position:absolute;width:57912;height:4191;visibility:visible;mso-wrap-style:square;v-text-anchor:top" o:gfxdata="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" filled="f" stroked="f">
-                  <v:textbox inset="0,0,0,0">
-                    <w:txbxContent>
-                      <w:p>
-                        <w:pPr>
-                          <w:spacing w:before="242"/>
-                          <w:ind w:left="194"/>
-                          <w:rPr>
-                            <w:rFonts w:ascii="Courier New"/>
-                            <w:sz w:val="18"/>
-                          </w:rPr>
-                        </w:pPr>
-                        <w:proofErr w:type="spellStart"/>
-                        <w:r>
-                          <w:rPr>
-                            <w:rFonts w:ascii="Courier New"/>
-                            <w:sz w:val="18"/>
-                          </w:rPr>
-                          <w:t>nslookup</w:t>
-                        </w:r>
-                        <w:proofErr w:type="spellEnd"/>
-                        <w:r>
-                          <w:rPr>
-                            <w:rFonts w:ascii="Courier New"/>
-                            <w:sz w:val="18"/>
-                          </w:rPr>
-                          <w:t xml:space="preserve"> example.com</w:t>
-                        </w:r>
-                      </w:p>
-                    </w:txbxContent>
-                  </v:textbox>
-                </v:shape>
-                <w10:wrap type="topAndBottom" anchorx="page"/>
-              </v:group>
-            </w:pict>
-          </mc:Fallback>
-        </mc:AlternateContent>
-      </w:r>
-      <w:r>
-        <w:t>Run:</w:t>
-      </w:r>
-    </w:p>
-    <w:p/>
-    <w:p>
-      <w:pPr>
-        <w:pStyle w:val="Heading3"/>
-      </w:pPr>
-      <w:r>
-        <w:t xml:space="preserve">DNS server: </w:t>
-      </w:r>
-      <w:r>
-        <w:tab/>
-      </w:r>
-    </w:p>
-    <w:p>
-      <w:r>
-        <w:t>ISBPVAD01.nust.edu.pk</w:t>
-      </w:r>
-    </w:p>
-    <w:p>
-      <w:pPr>
-        <w:pStyle w:val="Heading3"/>
-      </w:pPr>
-      <w:r>
-        <w:t xml:space="preserve">Returned IP address: </w:t>
-      </w:r>
-    </w:p>
-    <w:p>
-      <w:pPr>
-        <w:rPr>
-          <w:b/>
-          <w:bCs/>
-        </w:rPr>
-      </w:pPr>
-      <w:r>
-        <w:rPr>
-          <w:b/>
-          <w:bCs/>
-        </w:rPr>
-        <w:t>10.250.64.73</w:t>
-      </w:r>
-    </w:p>
-    <w:p>
-      <w:pPr>
-        <w:pStyle w:val="Heading3"/>
-      </w:pPr>
-      <w:r>
-        <w:t>Think</w:t>
-      </w:r>
-    </w:p>
-    <w:p>
-      <w:r>
-        <w:t>Suppose:</w:t>
+      <w:r>
+        <w:t>Create an empty GitHub repository using the naming convention provided by your instructor. Copy its repository URL</w:t>
       </w:r>
     </w:p>
     <w:p>
@@ -3331,11 +2052,11 @@
         <w:pStyle w:val="ListParagraph"/>
         <w:numPr>
           <w:ilvl w:val="0"/>
-          <w:numId w:val="16"/>
+          <w:numId w:val="20"/>
         </w:numPr>
       </w:pPr>
       <w:r>
-        <w:t>a remote IP is reachable,</w:t>
+        <w:t xml:space="preserve">. git branch -M main </w:t>
       </w:r>
     </w:p>
     <w:p>
@@ -3343,194 +2064,35 @@
         <w:pStyle w:val="ListParagraph"/>
         <w:numPr>
           <w:ilvl w:val="0"/>
-          <w:numId w:val="16"/>
+          <w:numId w:val="20"/>
         </w:numPr>
       </w:pPr>
       <w:r>
-        <w:t xml:space="preserve">but its hostname cannot be resolved. </w:t>
+        <w:t xml:space="preserve">git remote add origin </w:t>
       </w:r>
     </w:p>
     <w:p>
-      <w:r>
-        <w:t>Which service might you investigate?</w:t>
-      </w:r>
-    </w:p>
-    <w:p/>
-    <w:p>
-      <w:r>
-        <w:t>I will check the Domain Name Service (DNS) because if IP is reachable then DNS Service is causing issue as hostname cannot be resolved.</w:t>
+      <w:pPr>
+        <w:pStyle w:val="ListParagraph"/>
+        <w:numPr>
+          <w:ilvl w:val="0"/>
+          <w:numId w:val="20"/>
+        </w:numPr>
+      </w:pPr>
+      <w:r>
+        <w:t xml:space="preserve">git remote -v </w:t>
       </w:r>
     </w:p>
     <w:p>
       <w:pPr>
-        <w:pStyle w:val="Heading3"/>
-      </w:pPr>
-      <w:r>
-        <w:t>Trace a Route</w:t>
-      </w:r>
-    </w:p>
-    <w:p>
-      <w:r>
-        <w:rPr>
-          <w:noProof/>
-        </w:rPr>
-        <mc:AlternateContent>
-          <mc:Choice Requires="wps">
-            <w:drawing>
-              <wp:anchor distT="0" distB="0" distL="114300" distR="114300" simplePos="0" relativeHeight="251694080" behindDoc="0" locked="0" layoutInCell="1" allowOverlap="1" wp14:anchorId="519A86B8" wp14:editId="638ABA9C">
-                <wp:simplePos x="0" y="0"/>
-                <wp:positionH relativeFrom="margin">
-                  <wp:align>left</wp:align>
-                </wp:positionH>
-                <wp:positionV relativeFrom="paragraph">
-                  <wp:posOffset>194310</wp:posOffset>
-                </wp:positionV>
-                <wp:extent cx="5791200" cy="419100"/>
-                <wp:effectExtent l="0" t="0" r="19050" b="19050"/>
-                <wp:wrapNone/>
-                <wp:docPr id="62" name="Textbox 62"/>
-                <wp:cNvGraphicFramePr/>
-                <a:graphic xmlns:a="http://schemas.openxmlformats.org/drawingml/2006/main">
-                  <a:graphicData uri="http://schemas.microsoft.com/office/word/2010/wordprocessingShape">
-                    <wps:wsp>
-                      <wps:cNvSpPr txBox="1"/>
-                      <wps:spPr>
-                        <a:xfrm>
-                          <a:off x="0" y="0"/>
-                          <a:ext cx="5791200" cy="419100"/>
-                        </a:xfrm>
-                        <a:prstGeom prst="rect">
-                          <a:avLst/>
-                        </a:prstGeom>
-                        <a:ln>
-                          <a:solidFill>
-                            <a:schemeClr val="tx1"/>
-                          </a:solidFill>
-                        </a:ln>
-                      </wps:spPr>
-                      <wps:txbx>
-                        <w:txbxContent>
-                          <w:p>
-                            <w:pPr>
-                              <w:spacing w:before="242"/>
-                              <w:ind w:left="194"/>
-                              <w:rPr>
-                                <w:rFonts w:ascii="Courier New"/>
-                                <w:sz w:val="18"/>
-                              </w:rPr>
-                            </w:pPr>
-                            <w:r>
-                              <w:rPr>
-                                <w:rFonts w:ascii="Courier New"/>
-                                <w:sz w:val="18"/>
-                              </w:rPr>
-                              <w:t>tracert example.com</w:t>
-                            </w:r>
-                          </w:p>
-                        </w:txbxContent>
-                      </wps:txbx>
-                      <wps:bodyPr wrap="square" lIns="0" tIns="0" rIns="0" bIns="0" rtlCol="0">
-                        <a:noAutofit/>
-                      </wps:bodyPr>
-                    </wps:wsp>
-                  </a:graphicData>
-                </a:graphic>
-              </wp:anchor>
-            </w:drawing>
-          </mc:Choice>
-          <mc:Fallback>
-            <w:pict>
-              <v:shape w14:anchorId="519A86B8" id="Textbox 62" o:spid="_x0000_s1039" type="#_x0000_t202" style="position:absolute;margin-left:0;margin-top:15.3pt;width:456pt;height:33pt;z-index:251694080;visibility:visible;mso-wrap-style:square;mso-wrap-distance-left:9pt;mso-wrap-distance-top:0;mso-wrap-distance-right:9pt;mso-wrap-distance-bottom:0;mso-position-horizontal:left;mso-position-horizontal-relative:margin;mso-position-vertical:absolute;mso-position-vertical-relative:text;v-text-anchor:top" o:gfxdata="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" filled="f" strokecolor="black [3213]">
-                <v:textbox inset="0,0,0,0">
-                  <w:txbxContent>
-                    <w:p>
-                      <w:pPr>
-                        <w:spacing w:before="242"/>
-                        <w:ind w:left="194"/>
-                        <w:rPr>
-                          <w:rFonts w:ascii="Courier New"/>
-                          <w:sz w:val="18"/>
-                        </w:rPr>
-                      </w:pPr>
-                      <w:proofErr w:type="spellStart"/>
-                      <w:r>
-                        <w:rPr>
-                          <w:rFonts w:ascii="Courier New"/>
-                          <w:sz w:val="18"/>
-                        </w:rPr>
-                        <w:t>tracert</w:t>
-                      </w:r>
-                      <w:proofErr w:type="spellEnd"/>
-                      <w:r>
-                        <w:rPr>
-                          <w:rFonts w:ascii="Courier New"/>
-                          <w:sz w:val="18"/>
-                        </w:rPr>
-                        <w:t xml:space="preserve"> example.com</w:t>
-                      </w:r>
-                    </w:p>
-                  </w:txbxContent>
-                </v:textbox>
-                <w10:wrap anchorx="margin"/>
-              </v:shape>
-            </w:pict>
-          </mc:Fallback>
-        </mc:AlternateContent>
-      </w:r>
-      <w:r>
-        <w:t>Windows:</w:t>
-      </w:r>
-    </w:p>
-    <w:p/>
-    <w:p/>
-    <w:p>
-      <w:pPr>
-        <w:pStyle w:val="Heading3"/>
-      </w:pPr>
-      <w:r>
-        <w:t xml:space="preserve">First hop: </w:t>
-      </w:r>
-      <w:r>
-        <w:tab/>
-      </w:r>
-    </w:p>
-    <w:p>
-      <w:r>
-        <w:t>1    12 ms     3 ms    10 ms  10.202.24.1</w:t>
-      </w:r>
-    </w:p>
-    <w:p>
-      <w:pPr>
-        <w:pStyle w:val="Heading3"/>
-      </w:pPr>
-      <w:r>
-        <w:t xml:space="preserve">Number of visible hops: </w:t>
-      </w:r>
-      <w:r>
-        <w:tab/>
-      </w:r>
-    </w:p>
-    <w:p>
-      <w:r>
-        <w:t>13</w:t>
-      </w:r>
-    </w:p>
-    <w:p>
-      <w:pPr>
-        <w:pStyle w:val="Heading3"/>
-      </w:pPr>
-      <w:r>
-        <w:t xml:space="preserve">Did any hops show a timeout? </w:t>
-      </w:r>
-    </w:p>
-    <w:p>
-      <w:r>
-        <w:t>Yes</w:t>
-      </w:r>
-    </w:p>
-    <w:p>
-      <w:r>
-        <w:t>A timeout on one hop does not automatically prove that the entire route is broken.</w:t>
+        <w:pStyle w:val="ListParagraph"/>
+        <w:numPr>
+          <w:ilvl w:val="0"/>
+          <w:numId w:val="20"/>
+        </w:numPr>
+      </w:pPr>
+      <w:r>
+        <w:t xml:space="preserve">git push -u origin main </w:t>
       </w:r>
     </w:p>
     <w:p>
@@ -3539,18 +2101,18 @@
           <w:noProof/>
         </w:rPr>
         <w:drawing>
-          <wp:anchor distT="0" distB="0" distL="114300" distR="114300" simplePos="0" relativeHeight="251692032" behindDoc="0" locked="0" layoutInCell="1" allowOverlap="1" wp14:anchorId="19EEB2A7" wp14:editId="0765DE9D">
+          <wp:anchor distT="0" distB="0" distL="114300" distR="114300" simplePos="0" relativeHeight="251683840" behindDoc="0" locked="0" layoutInCell="1" allowOverlap="1" wp14:anchorId="7347EF2D" wp14:editId="4583928D">
             <wp:simplePos x="0" y="0"/>
             <wp:positionH relativeFrom="margin">
-              <wp:align>left</wp:align>
+              <wp:align>right</wp:align>
             </wp:positionH>
             <wp:positionV relativeFrom="paragraph">
-              <wp:posOffset>261620</wp:posOffset>
+              <wp:posOffset>255905</wp:posOffset>
             </wp:positionV>
             <wp:extent cx="5731510" cy="3223895"/>
             <wp:effectExtent l="0" t="0" r="2540" b="0"/>
             <wp:wrapNone/>
-            <wp:docPr id="1318906301" name="Picture 6"/>
+            <wp:docPr id="1916772351" name="Picture 18"/>
             <wp:cNvGraphicFramePr>
               <a:graphicFrameLocks xmlns:a="http://schemas.openxmlformats.org/drawingml/2006/main" noChangeAspect="1"/>
             </wp:cNvGraphicFramePr>
@@ -3558,7 +2120,7 @@
               <a:graphicData uri="http://schemas.openxmlformats.org/drawingml/2006/picture">
                 <pic:pic xmlns:pic="http://schemas.openxmlformats.org/drawingml/2006/picture">
                   <pic:nvPicPr>
-                    <pic:cNvPr id="1318906301" name="Picture 1318906301"/>
+                    <pic:cNvPr id="1916772351" name="Picture 1916772351"/>
                     <pic:cNvPicPr/>
                   </pic:nvPicPr>
                   <pic:blipFill>
@@ -3588,6 +2150,9 @@
           </wp:anchor>
         </w:drawing>
       </w:r>
+      <w:r>
+        <w:t>Open the repository in your browser. Confirm your files and commit history are visible.</w:t>
+      </w:r>
     </w:p>
     <w:p/>
     <w:p/>
@@ -3599,7 +2164,6 @@
     <w:p/>
     <w:p/>
     <w:p/>
-    <w:p/>
     <w:p>
       <w:pPr>
         <w:pStyle w:val="Heading2"/>
@@ -3614,235 +2178,18 @@
           <w:bCs/>
         </w:rPr>
         <w:lastRenderedPageBreak/>
-        <w:t>Task 4</w:t>
-      </w:r>
-      <w:r>
-        <w:rPr>
-          <w:b/>
-          <w:bCs/>
-        </w:rPr>
-        <w:t>:</w:t>
+        <w:t>Task 5:</w:t>
       </w:r>
     </w:p>
     <w:p>
-      <w:pPr>
-        <w:pStyle w:val="Heading3"/>
-        <w:rPr>
-          <w:spacing w:val="-2"/>
-        </w:rPr>
-      </w:pPr>
-      <w:r>
-        <w:rPr>
-          <w:spacing w:val="-2"/>
-        </w:rPr>
-        <w:t>Simple</w:t>
-      </w:r>
-      <w:r>
-        <w:t xml:space="preserve"> 24 </w:t>
-      </w:r>
-      <w:r>
-        <w:rPr>
-          <w:spacing w:val="-2"/>
-        </w:rPr>
-        <w:t>Networks:</w:t>
-      </w:r>
-    </w:p>
-    <w:p>
-      <w:r>
-        <w:t>For this lab, focus on simple</w:t>
-      </w:r>
-      <w:r>
-        <w:t xml:space="preserve"> 24 networks</w:t>
-      </w:r>
-    </w:p>
-    <w:p>
-      <w:pPr>
-        <w:pStyle w:val="Heading3"/>
-        <w:rPr>
-          <w:b/>
-          <w:bCs/>
-        </w:rPr>
-      </w:pPr>
-      <w:r>
-        <w:rPr>
-          <w:b/>
-          <w:bCs/>
-        </w:rPr>
-        <w:t>Practice</w:t>
-      </w:r>
-    </w:p>
-    <w:p>
-      <w:r>
-        <w:t>Are these pairs on the same</w:t>
-      </w:r>
-      <w:r>
-        <w:tab/>
-        <w:t>network?</w:t>
-      </w:r>
-    </w:p>
-    <w:p>
-      <w:pPr>
-        <w:pStyle w:val="Heading3"/>
-        <w:rPr>
-          <w:b/>
-          <w:bCs/>
-        </w:rPr>
-      </w:pPr>
-      <w:r>
-        <w:t xml:space="preserve"> </w:t>
-      </w:r>
-      <w:r>
-        <w:rPr>
-          <w:b/>
-          <w:bCs/>
-        </w:rPr>
-        <w:t>Pair A</w:t>
-      </w:r>
-    </w:p>
-    <w:p>
-      <w:r>
-        <w:rPr>
-          <w:noProof/>
-        </w:rPr>
-        <mc:AlternateContent>
-          <mc:Choice Requires="wps">
-            <w:drawing>
-              <wp:anchor distT="0" distB="0" distL="114300" distR="114300" simplePos="0" relativeHeight="251696128" behindDoc="0" locked="0" layoutInCell="1" allowOverlap="1" wp14:anchorId="30184643" wp14:editId="614468B8">
-                <wp:simplePos x="0" y="0"/>
-                <wp:positionH relativeFrom="column">
-                  <wp:posOffset>0</wp:posOffset>
-                </wp:positionH>
-                <wp:positionV relativeFrom="paragraph">
-                  <wp:posOffset>0</wp:posOffset>
-                </wp:positionV>
-                <wp:extent cx="5791200" cy="590550"/>
-                <wp:effectExtent l="0" t="0" r="19050" b="19050"/>
-                <wp:wrapNone/>
-                <wp:docPr id="92" name="Textbox 92"/>
-                <wp:cNvGraphicFramePr/>
-                <a:graphic xmlns:a="http://schemas.openxmlformats.org/drawingml/2006/main">
-                  <a:graphicData uri="http://schemas.microsoft.com/office/word/2010/wordprocessingShape">
-                    <wps:wsp>
-                      <wps:cNvSpPr txBox="1"/>
-                      <wps:spPr>
-                        <a:xfrm>
-                          <a:off x="0" y="0"/>
-                          <a:ext cx="5791200" cy="590550"/>
-                        </a:xfrm>
-                        <a:prstGeom prst="rect">
-                          <a:avLst/>
-                        </a:prstGeom>
-                        <a:ln>
-                          <a:solidFill>
-                            <a:schemeClr val="tx1"/>
-                          </a:solidFill>
-                        </a:ln>
-                      </wps:spPr>
-                      <wps:txbx>
-                        <w:txbxContent>
-                          <w:p>
-                            <w:pPr>
-                              <w:spacing w:before="242"/>
-                              <w:ind w:left="194"/>
-                              <w:rPr>
-                                <w:rFonts w:ascii="Courier New"/>
-                                <w:sz w:val="18"/>
-                              </w:rPr>
-                            </w:pPr>
-                            <w:r>
-                              <w:rPr>
-                                <w:rFonts w:ascii="Courier New"/>
-                                <w:spacing w:val="-2"/>
-                                <w:sz w:val="18"/>
-                              </w:rPr>
-                              <w:t>192.168.5.10</w:t>
-                            </w:r>
-                          </w:p>
-                          <w:p>
-                            <w:pPr>
-                              <w:spacing w:before="66"/>
-                              <w:ind w:left="194"/>
-                              <w:rPr>
-                                <w:rFonts w:ascii="Courier New"/>
-                                <w:sz w:val="18"/>
-                              </w:rPr>
-                            </w:pPr>
-                            <w:r>
-                              <w:rPr>
-                                <w:rFonts w:ascii="Courier New"/>
-                                <w:spacing w:val="-2"/>
-                                <w:sz w:val="18"/>
-                              </w:rPr>
-                              <w:t>192.168.5.90</w:t>
-                            </w:r>
-                          </w:p>
-                        </w:txbxContent>
-                      </wps:txbx>
-                      <wps:bodyPr wrap="square" lIns="0" tIns="0" rIns="0" bIns="0" rtlCol="0">
-                        <a:noAutofit/>
-                      </wps:bodyPr>
-                    </wps:wsp>
-                  </a:graphicData>
-                </a:graphic>
-              </wp:anchor>
-            </w:drawing>
-          </mc:Choice>
-          <mc:Fallback>
-            <w:pict>
-              <v:shape w14:anchorId="30184643" id="Textbox 92" o:spid="_x0000_s1040" type="#_x0000_t202" style="position:absolute;margin-left:0;margin-top:0;width:456pt;height:46.5pt;z-index:251696128;visibility:visible;mso-wrap-style:square;mso-wrap-distance-left:9pt;mso-wrap-distance-top:0;mso-wrap-distance-right:9pt;mso-wrap-distance-bottom:0;mso-position-horizontal:absolute;mso-position-horizontal-relative:text;mso-position-vertical:absolute;mso-position-vertical-relative:text;v-text-anchor:top" o:gfxdata="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" filled="f" strokecolor="black [3213]">
-                <v:textbox inset="0,0,0,0">
-                  <w:txbxContent>
-                    <w:p>
-                      <w:pPr>
-                        <w:spacing w:before="242"/>
-                        <w:ind w:left="194"/>
-                        <w:rPr>
-                          <w:rFonts w:ascii="Courier New"/>
-                          <w:sz w:val="18"/>
-                        </w:rPr>
-                      </w:pPr>
-                      <w:r>
-                        <w:rPr>
-                          <w:rFonts w:ascii="Courier New"/>
-                          <w:spacing w:val="-2"/>
-                          <w:sz w:val="18"/>
-                        </w:rPr>
-                        <w:t>192.168.5.10</w:t>
-                      </w:r>
-                    </w:p>
-                    <w:p>
-                      <w:pPr>
-                        <w:spacing w:before="66"/>
-                        <w:ind w:left="194"/>
-                        <w:rPr>
-                          <w:rFonts w:ascii="Courier New"/>
-                          <w:sz w:val="18"/>
-                        </w:rPr>
-                      </w:pPr>
-                      <w:r>
-                        <w:rPr>
-                          <w:rFonts w:ascii="Courier New"/>
-                          <w:spacing w:val="-2"/>
-                          <w:sz w:val="18"/>
-                        </w:rPr>
-                        <w:t>192.168.5.90</w:t>
-                      </w:r>
-                    </w:p>
-                  </w:txbxContent>
-                </v:textbox>
-              </v:shape>
-            </w:pict>
-          </mc:Fallback>
-        </mc:AlternateContent>
-      </w:r>
-    </w:p>
-    <w:p/>
-    <w:p>
-      <w:r>
-        <w:t xml:space="preserve">Answer: </w:t>
-      </w:r>
-      <w:r>
-        <w:tab/>
+      <w:r>
+        <w:t>Create or use the Issue assigned by your instructor. Example: "Add a GB conversion line to the storage estimator</w:t>
+      </w:r>
+      <w:r>
+        <w:t>”</w:t>
+      </w:r>
+      <w:r>
+        <w:t>.</w:t>
       </w:r>
     </w:p>
     <w:p>
@@ -3850,173 +2197,19 @@
         <w:pStyle w:val="ListParagraph"/>
         <w:numPr>
           <w:ilvl w:val="0"/>
-          <w:numId w:val="17"/>
+          <w:numId w:val="21"/>
         </w:numPr>
       </w:pPr>
       <w:r>
-        <w:t>Yes</w:t>
-      </w:r>
-    </w:p>
-    <w:p>
-      <w:pPr>
-        <w:pStyle w:val="Heading3"/>
-        <w:rPr>
-          <w:b/>
-          <w:bCs/>
-        </w:rPr>
-      </w:pPr>
-      <w:r>
-        <w:rPr>
-          <w:noProof/>
-        </w:rPr>
-        <mc:AlternateContent>
-          <mc:Choice Requires="wps">
-            <w:drawing>
-              <wp:anchor distT="0" distB="0" distL="114300" distR="114300" simplePos="0" relativeHeight="251698176" behindDoc="0" locked="0" layoutInCell="1" allowOverlap="1" wp14:anchorId="5B7E4F86" wp14:editId="05F382A6">
-                <wp:simplePos x="0" y="0"/>
-                <wp:positionH relativeFrom="margin">
-                  <wp:align>left</wp:align>
-                </wp:positionH>
-                <wp:positionV relativeFrom="paragraph">
-                  <wp:posOffset>278765</wp:posOffset>
-                </wp:positionV>
-                <wp:extent cx="5791200" cy="590550"/>
-                <wp:effectExtent l="0" t="0" r="19050" b="19050"/>
-                <wp:wrapNone/>
-                <wp:docPr id="95" name="Textbox 95"/>
-                <wp:cNvGraphicFramePr/>
-                <a:graphic xmlns:a="http://schemas.openxmlformats.org/drawingml/2006/main">
-                  <a:graphicData uri="http://schemas.microsoft.com/office/word/2010/wordprocessingShape">
-                    <wps:wsp>
-                      <wps:cNvSpPr txBox="1"/>
-                      <wps:spPr>
-                        <a:xfrm>
-                          <a:off x="0" y="0"/>
-                          <a:ext cx="5791200" cy="590550"/>
-                        </a:xfrm>
-                        <a:prstGeom prst="rect">
-                          <a:avLst/>
-                        </a:prstGeom>
-                        <a:ln>
-                          <a:solidFill>
-                            <a:schemeClr val="tx1"/>
-                          </a:solidFill>
-                        </a:ln>
-                      </wps:spPr>
-                      <wps:txbx>
-                        <w:txbxContent>
-                          <w:p>
-                            <w:pPr>
-                              <w:spacing w:before="242"/>
-                              <w:ind w:left="194"/>
-                              <w:rPr>
-                                <w:rFonts w:ascii="Courier New"/>
-                                <w:sz w:val="18"/>
-                              </w:rPr>
-                            </w:pPr>
-                            <w:r>
-                              <w:rPr>
-                                <w:rFonts w:ascii="Courier New"/>
-                                <w:spacing w:val="-2"/>
-                                <w:sz w:val="18"/>
-                              </w:rPr>
-                              <w:t>192.168.5.10</w:t>
-                            </w:r>
-                          </w:p>
-                          <w:p>
-                            <w:pPr>
-                              <w:spacing w:before="66"/>
-                              <w:ind w:left="194"/>
-                              <w:rPr>
-                                <w:rFonts w:ascii="Courier New"/>
-                                <w:sz w:val="18"/>
-                              </w:rPr>
-                            </w:pPr>
-                            <w:r>
-                              <w:rPr>
-                                <w:rFonts w:ascii="Courier New"/>
-                                <w:spacing w:val="-2"/>
-                                <w:sz w:val="18"/>
-                              </w:rPr>
-                              <w:t>192.168.6.10</w:t>
-                            </w:r>
-                          </w:p>
-                        </w:txbxContent>
-                      </wps:txbx>
-                      <wps:bodyPr wrap="square" lIns="0" tIns="0" rIns="0" bIns="0" rtlCol="0">
-                        <a:noAutofit/>
-                      </wps:bodyPr>
-                    </wps:wsp>
-                  </a:graphicData>
-                </a:graphic>
-              </wp:anchor>
-            </w:drawing>
-          </mc:Choice>
-          <mc:Fallback>
-            <w:pict>
-              <v:shape w14:anchorId="5B7E4F86" id="Textbox 95" o:spid="_x0000_s1041" type="#_x0000_t202" style="position:absolute;margin-left:0;margin-top:21.95pt;width:456pt;height:46.5pt;z-index:251698176;visibility:visible;mso-wrap-style:square;mso-wrap-distance-left:9pt;mso-wrap-distance-top:0;mso-wrap-distance-right:9pt;mso-wrap-distance-bottom:0;mso-position-horizontal:left;mso-position-horizontal-relative:margin;mso-position-vertical:absolute;mso-position-vertical-relative:text;v-text-anchor:top" o:gfxdata="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" filled="f" strokecolor="black [3213]">
-                <v:textbox inset="0,0,0,0">
-                  <w:txbxContent>
-                    <w:p>
-                      <w:pPr>
-                        <w:spacing w:before="242"/>
-                        <w:ind w:left="194"/>
-                        <w:rPr>
-                          <w:rFonts w:ascii="Courier New"/>
-                          <w:sz w:val="18"/>
-                        </w:rPr>
-                      </w:pPr>
-                      <w:r>
-                        <w:rPr>
-                          <w:rFonts w:ascii="Courier New"/>
-                          <w:spacing w:val="-2"/>
-                          <w:sz w:val="18"/>
-                        </w:rPr>
-                        <w:t>192.168.5.10</w:t>
-                      </w:r>
-                    </w:p>
-                    <w:p>
-                      <w:pPr>
-                        <w:spacing w:before="66"/>
-                        <w:ind w:left="194"/>
-                        <w:rPr>
-                          <w:rFonts w:ascii="Courier New"/>
-                          <w:sz w:val="18"/>
-                        </w:rPr>
-                      </w:pPr>
-                      <w:r>
-                        <w:rPr>
-                          <w:rFonts w:ascii="Courier New"/>
-                          <w:spacing w:val="-2"/>
-                          <w:sz w:val="18"/>
-                        </w:rPr>
-                        <w:t>192.168.6.10</w:t>
-                      </w:r>
-                    </w:p>
-                  </w:txbxContent>
-                </v:textbox>
-                <w10:wrap anchorx="margin"/>
-              </v:shape>
-            </w:pict>
-          </mc:Fallback>
-        </mc:AlternateContent>
-      </w:r>
-      <w:r>
-        <w:rPr>
-          <w:b/>
-          <w:bCs/>
-        </w:rPr>
-        <w:t>Pair B</w:t>
-      </w:r>
-    </w:p>
-    <w:p/>
-    <w:p/>
-    <w:p>
-      <w:r>
-        <w:t xml:space="preserve">Answer: </w:t>
-      </w:r>
-      <w:r>
-        <w:tab/>
+        <w:t>git switch -c feature/</w:t>
+      </w:r>
+      <w:proofErr w:type="spellStart"/>
+      <w:r>
+        <w:t>gb</w:t>
+      </w:r>
+      <w:proofErr w:type="spellEnd"/>
+      <w:r>
+        <w:t xml:space="preserve">-output </w:t>
       </w:r>
     </w:p>
     <w:p>
@@ -4024,173 +2217,11 @@
         <w:pStyle w:val="ListParagraph"/>
         <w:numPr>
           <w:ilvl w:val="0"/>
-          <w:numId w:val="17"/>
+          <w:numId w:val="21"/>
         </w:numPr>
       </w:pPr>
       <w:r>
-        <w:t>No</w:t>
-      </w:r>
-    </w:p>
-    <w:p>
-      <w:pPr>
-        <w:pStyle w:val="Heading3"/>
-        <w:rPr>
-          <w:b/>
-          <w:bCs/>
-        </w:rPr>
-      </w:pPr>
-      <w:r>
-        <w:rPr>
-          <w:noProof/>
-        </w:rPr>
-        <mc:AlternateContent>
-          <mc:Choice Requires="wps">
-            <w:drawing>
-              <wp:anchor distT="0" distB="0" distL="114300" distR="114300" simplePos="0" relativeHeight="251700224" behindDoc="0" locked="0" layoutInCell="1" allowOverlap="1" wp14:anchorId="549482ED" wp14:editId="31939DD5">
-                <wp:simplePos x="0" y="0"/>
-                <wp:positionH relativeFrom="margin">
-                  <wp:align>left</wp:align>
-                </wp:positionH>
-                <wp:positionV relativeFrom="paragraph">
-                  <wp:posOffset>240665</wp:posOffset>
-                </wp:positionV>
-                <wp:extent cx="5791200" cy="590550"/>
-                <wp:effectExtent l="0" t="0" r="19050" b="19050"/>
-                <wp:wrapNone/>
-                <wp:docPr id="98" name="Textbox 98"/>
-                <wp:cNvGraphicFramePr/>
-                <a:graphic xmlns:a="http://schemas.openxmlformats.org/drawingml/2006/main">
-                  <a:graphicData uri="http://schemas.microsoft.com/office/word/2010/wordprocessingShape">
-                    <wps:wsp>
-                      <wps:cNvSpPr txBox="1"/>
-                      <wps:spPr>
-                        <a:xfrm>
-                          <a:off x="0" y="0"/>
-                          <a:ext cx="5791200" cy="590550"/>
-                        </a:xfrm>
-                        <a:prstGeom prst="rect">
-                          <a:avLst/>
-                        </a:prstGeom>
-                        <a:ln>
-                          <a:solidFill>
-                            <a:schemeClr val="tx1"/>
-                          </a:solidFill>
-                        </a:ln>
-                      </wps:spPr>
-                      <wps:txbx>
-                        <w:txbxContent>
-                          <w:p>
-                            <w:pPr>
-                              <w:spacing w:before="242"/>
-                              <w:ind w:left="194"/>
-                              <w:rPr>
-                                <w:rFonts w:ascii="Courier New"/>
-                                <w:sz w:val="18"/>
-                              </w:rPr>
-                            </w:pPr>
-                            <w:r>
-                              <w:rPr>
-                                <w:rFonts w:ascii="Courier New"/>
-                                <w:spacing w:val="-2"/>
-                                <w:sz w:val="18"/>
-                              </w:rPr>
-                              <w:t>10.20.30.5</w:t>
-                            </w:r>
-                          </w:p>
-                          <w:p>
-                            <w:pPr>
-                              <w:spacing w:before="66"/>
-                              <w:ind w:left="194"/>
-                              <w:rPr>
-                                <w:rFonts w:ascii="Courier New"/>
-                                <w:sz w:val="18"/>
-                              </w:rPr>
-                            </w:pPr>
-                            <w:r>
-                              <w:rPr>
-                                <w:rFonts w:ascii="Courier New"/>
-                                <w:spacing w:val="-2"/>
-                                <w:sz w:val="18"/>
-                              </w:rPr>
-                              <w:t>10.20.30.200</w:t>
-                            </w:r>
-                          </w:p>
-                        </w:txbxContent>
-                      </wps:txbx>
-                      <wps:bodyPr wrap="square" lIns="0" tIns="0" rIns="0" bIns="0" rtlCol="0">
-                        <a:noAutofit/>
-                      </wps:bodyPr>
-                    </wps:wsp>
-                  </a:graphicData>
-                </a:graphic>
-              </wp:anchor>
-            </w:drawing>
-          </mc:Choice>
-          <mc:Fallback>
-            <w:pict>
-              <v:shape w14:anchorId="549482ED" id="Textbox 98" o:spid="_x0000_s1042" type="#_x0000_t202" style="position:absolute;margin-left:0;margin-top:18.95pt;width:456pt;height:46.5pt;z-index:251700224;visibility:visible;mso-wrap-style:square;mso-wrap-distance-left:9pt;mso-wrap-distance-top:0;mso-wrap-distance-right:9pt;mso-wrap-distance-bottom:0;mso-position-horizontal:left;mso-position-horizontal-relative:margin;mso-position-vertical:absolute;mso-position-vertical-relative:text;v-text-anchor:top" o:gfxdata="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" filled="f" strokecolor="black [3213]">
-                <v:textbox inset="0,0,0,0">
-                  <w:txbxContent>
-                    <w:p>
-                      <w:pPr>
-                        <w:spacing w:before="242"/>
-                        <w:ind w:left="194"/>
-                        <w:rPr>
-                          <w:rFonts w:ascii="Courier New"/>
-                          <w:sz w:val="18"/>
-                        </w:rPr>
-                      </w:pPr>
-                      <w:r>
-                        <w:rPr>
-                          <w:rFonts w:ascii="Courier New"/>
-                          <w:spacing w:val="-2"/>
-                          <w:sz w:val="18"/>
-                        </w:rPr>
-                        <w:t>10.20.30.5</w:t>
-                      </w:r>
-                    </w:p>
-                    <w:p>
-                      <w:pPr>
-                        <w:spacing w:before="66"/>
-                        <w:ind w:left="194"/>
-                        <w:rPr>
-                          <w:rFonts w:ascii="Courier New"/>
-                          <w:sz w:val="18"/>
-                        </w:rPr>
-                      </w:pPr>
-                      <w:r>
-                        <w:rPr>
-                          <w:rFonts w:ascii="Courier New"/>
-                          <w:spacing w:val="-2"/>
-                          <w:sz w:val="18"/>
-                        </w:rPr>
-                        <w:t>10.20.30.200</w:t>
-                      </w:r>
-                    </w:p>
-                  </w:txbxContent>
-                </v:textbox>
-                <w10:wrap anchorx="margin"/>
-              </v:shape>
-            </w:pict>
-          </mc:Fallback>
-        </mc:AlternateContent>
-      </w:r>
-      <w:r>
-        <w:rPr>
-          <w:b/>
-          <w:bCs/>
-        </w:rPr>
-        <w:t>Pair C</w:t>
-      </w:r>
-    </w:p>
-    <w:p/>
-    <w:p/>
-    <w:p>
-      <w:r>
-        <w:t xml:space="preserve">Answer: </w:t>
-      </w:r>
-      <w:r>
-        <w:tab/>
+        <w:t xml:space="preserve">git branch </w:t>
       </w:r>
     </w:p>
     <w:p>
@@ -4198,45 +2229,11 @@
         <w:pStyle w:val="ListParagraph"/>
         <w:numPr>
           <w:ilvl w:val="0"/>
-          <w:numId w:val="17"/>
+          <w:numId w:val="21"/>
         </w:numPr>
       </w:pPr>
       <w:r>
-        <w:t>Yes</w:t>
-      </w:r>
-    </w:p>
-    <w:p/>
-    <w:p>
-      <w:pPr>
-        <w:pStyle w:val="Heading2"/>
-        <w:rPr>
-          <w:b/>
-          <w:bCs/>
-        </w:rPr>
-      </w:pPr>
-      <w:r>
-        <w:rPr>
-          <w:b/>
-          <w:bCs/>
-        </w:rPr>
-        <w:t>Task 5</w:t>
-      </w:r>
-      <w:r>
-        <w:rPr>
-          <w:b/>
-          <w:bCs/>
-        </w:rPr>
-        <w:t>:</w:t>
-      </w:r>
-    </w:p>
-    <w:p>
-      <w:r>
-        <w:t>Use Wireshark only as directed by your instructor. Capture only your own lab-generated traffic.</w:t>
-      </w:r>
-    </w:p>
-    <w:p>
-      <w:r>
-        <w:t>Steps</w:t>
+        <w:t xml:space="preserve">Modify the Python program only for the assigned feature. </w:t>
       </w:r>
     </w:p>
     <w:p>
@@ -4244,11 +2241,11 @@
         <w:pStyle w:val="ListParagraph"/>
         <w:numPr>
           <w:ilvl w:val="0"/>
-          <w:numId w:val="17"/>
+          <w:numId w:val="21"/>
         </w:numPr>
       </w:pPr>
       <w:r>
-        <w:t>Open Wireshark.</w:t>
+        <w:t xml:space="preserve">Test it before committing. python storage_estimator.py </w:t>
       </w:r>
     </w:p>
     <w:p>
@@ -4256,11 +2253,11 @@
         <w:pStyle w:val="ListParagraph"/>
         <w:numPr>
           <w:ilvl w:val="0"/>
-          <w:numId w:val="17"/>
+          <w:numId w:val="21"/>
         </w:numPr>
       </w:pPr>
       <w:r>
-        <w:t>Select the instructed network interface.</w:t>
+        <w:t xml:space="preserve">git diff </w:t>
       </w:r>
     </w:p>
     <w:p>
@@ -4268,11 +2265,11 @@
         <w:pStyle w:val="ListParagraph"/>
         <w:numPr>
           <w:ilvl w:val="0"/>
-          <w:numId w:val="17"/>
+          <w:numId w:val="21"/>
         </w:numPr>
       </w:pPr>
       <w:r>
-        <w:t>Start capture.</w:t>
+        <w:t xml:space="preserve">git add storage_estimator.py </w:t>
       </w:r>
     </w:p>
     <w:p>
@@ -4280,11 +2277,11 @@
         <w:pStyle w:val="ListParagraph"/>
         <w:numPr>
           <w:ilvl w:val="0"/>
-          <w:numId w:val="17"/>
+          <w:numId w:val="21"/>
         </w:numPr>
       </w:pPr>
       <w:r>
-        <w:t>Generate a short ping to your local gateway.</w:t>
+        <w:t xml:space="preserve">git commit -m "Add GB conversion output" </w:t>
       </w:r>
     </w:p>
     <w:p>
@@ -4292,528 +2289,24 @@
         <w:pStyle w:val="ListParagraph"/>
         <w:numPr>
           <w:ilvl w:val="0"/>
-          <w:numId w:val="17"/>
+          <w:numId w:val="21"/>
         </w:numPr>
       </w:pPr>
       <w:r>
-        <w:lastRenderedPageBreak/>
-        <w:t>Stop capture.</w:t>
-      </w:r>
-    </w:p>
-    <w:p>
-      <w:pPr>
-        <w:pStyle w:val="ListParagraph"/>
-        <w:numPr>
-          <w:ilvl w:val="0"/>
-          <w:numId w:val="17"/>
-        </w:numPr>
-      </w:pPr>
-      <w:r>
-        <w:t>Apply this display filter:</w:t>
-      </w:r>
-    </w:p>
-    <w:p/>
-    <w:p/>
-    <w:p>
-      <w:r>
-        <w:rPr>
-          <w:noProof/>
-        </w:rPr>
-        <w:drawing>
-          <wp:anchor distT="0" distB="0" distL="114300" distR="114300" simplePos="0" relativeHeight="251702272" behindDoc="0" locked="0" layoutInCell="1" allowOverlap="1" wp14:anchorId="59925D86" wp14:editId="2E448BFE">
-            <wp:simplePos x="0" y="0"/>
-            <wp:positionH relativeFrom="margin">
-              <wp:align>right</wp:align>
-            </wp:positionH>
-            <wp:positionV relativeFrom="paragraph">
-              <wp:posOffset>3489960</wp:posOffset>
-            </wp:positionV>
-            <wp:extent cx="5731510" cy="3223895"/>
-            <wp:effectExtent l="0" t="0" r="2540" b="0"/>
-            <wp:wrapNone/>
-            <wp:docPr id="1860264410" name="Picture 8"/>
-            <wp:cNvGraphicFramePr>
-              <a:graphicFrameLocks xmlns:a="http://schemas.openxmlformats.org/drawingml/2006/main" noChangeAspect="1"/>
-            </wp:cNvGraphicFramePr>
-            <a:graphic xmlns:a="http://schemas.openxmlformats.org/drawingml/2006/main">
-              <a:graphicData uri="http://schemas.openxmlformats.org/drawingml/2006/picture">
-                <pic:pic xmlns:pic="http://schemas.openxmlformats.org/drawingml/2006/picture">
-                  <pic:nvPicPr>
-                    <pic:cNvPr id="1860264410" name="Picture 1860264410"/>
-                    <pic:cNvPicPr/>
-                  </pic:nvPicPr>
-                  <pic:blipFill>
-                    <a:blip r:embed="rId13" cstate="print">
-                      <a:extLst>
-                        <a:ext uri="{28A0092B-C50C-407E-A947-70E740481C1C}">
-                          <a14:useLocalDpi xmlns:a14="http://schemas.microsoft.com/office/drawing/2010/main" val="0"/>
-                        </a:ext>
-                      </a:extLst>
-                    </a:blip>
-                    <a:stretch>
-                      <a:fillRect/>
-                    </a:stretch>
-                  </pic:blipFill>
-                  <pic:spPr>
-                    <a:xfrm>
-                      <a:off x="0" y="0"/>
-                      <a:ext cx="5731510" cy="3223895"/>
-                    </a:xfrm>
-                    <a:prstGeom prst="rect">
-                      <a:avLst/>
-                    </a:prstGeom>
-                  </pic:spPr>
-                </pic:pic>
-              </a:graphicData>
-            </a:graphic>
-          </wp:anchor>
-        </w:drawing>
-      </w:r>
-      <w:r>
-        <w:rPr>
-          <w:noProof/>
-        </w:rPr>
-        <w:drawing>
-          <wp:anchor distT="0" distB="0" distL="114300" distR="114300" simplePos="0" relativeHeight="251701248" behindDoc="0" locked="0" layoutInCell="1" allowOverlap="1" wp14:anchorId="2CEBF1BD" wp14:editId="1DC932AB">
-            <wp:simplePos x="0" y="0"/>
-            <wp:positionH relativeFrom="margin">
-              <wp:align>right</wp:align>
-            </wp:positionH>
-            <wp:positionV relativeFrom="paragraph">
-              <wp:posOffset>0</wp:posOffset>
-            </wp:positionV>
-            <wp:extent cx="5731510" cy="3223895"/>
-            <wp:effectExtent l="0" t="0" r="2540" b="0"/>
-            <wp:wrapNone/>
-            <wp:docPr id="995267786" name="Picture 7"/>
-            <wp:cNvGraphicFramePr>
-              <a:graphicFrameLocks xmlns:a="http://schemas.openxmlformats.org/drawingml/2006/main" noChangeAspect="1"/>
-            </wp:cNvGraphicFramePr>
-            <a:graphic xmlns:a="http://schemas.openxmlformats.org/drawingml/2006/main">
-              <a:graphicData uri="http://schemas.openxmlformats.org/drawingml/2006/picture">
-                <pic:pic xmlns:pic="http://schemas.openxmlformats.org/drawingml/2006/picture">
-                  <pic:nvPicPr>
-                    <pic:cNvPr id="995267786" name="Picture 995267786"/>
-                    <pic:cNvPicPr/>
-                  </pic:nvPicPr>
-                  <pic:blipFill>
-                    <a:blip r:embed="rId14" cstate="print">
-                      <a:extLst>
-                        <a:ext uri="{28A0092B-C50C-407E-A947-70E740481C1C}">
-                          <a14:useLocalDpi xmlns:a14="http://schemas.microsoft.com/office/drawing/2010/main" val="0"/>
-                        </a:ext>
-                      </a:extLst>
-                    </a:blip>
-                    <a:stretch>
-                      <a:fillRect/>
-                    </a:stretch>
-                  </pic:blipFill>
-                  <pic:spPr>
-                    <a:xfrm>
-                      <a:off x="0" y="0"/>
-                      <a:ext cx="5731510" cy="3223895"/>
-                    </a:xfrm>
-                    <a:prstGeom prst="rect">
-                      <a:avLst/>
-                    </a:prstGeom>
-                  </pic:spPr>
-                </pic:pic>
-              </a:graphicData>
-            </a:graphic>
-          </wp:anchor>
-        </w:drawing>
-      </w:r>
-    </w:p>
-    <w:p/>
-    <w:p/>
-    <w:p/>
-    <w:p/>
-    <w:p/>
-    <w:p/>
-    <w:p/>
-    <w:p/>
-    <w:p/>
-    <w:p/>
-    <w:p/>
-    <w:p/>
-    <w:p/>
-    <w:p/>
-    <w:p/>
-    <w:p/>
-    <w:p/>
-    <w:p/>
-    <w:p/>
-    <w:p/>
-    <w:p/>
-    <w:p>
-      <w:r>
-        <w:t>Record:</w:t>
-      </w:r>
-    </w:p>
-    <w:p>
-      <w:pPr>
-        <w:rPr>
-          <w:b/>
-          <w:bCs/>
-        </w:rPr>
-      </w:pPr>
-      <w:r>
-        <w:rPr>
-          <w:b/>
-          <w:bCs/>
-        </w:rPr>
-        <w:t>Item</w:t>
-      </w:r>
-      <w:r>
-        <w:rPr>
-          <w:b/>
-          <w:bCs/>
-        </w:rPr>
-        <w:tab/>
-      </w:r>
-      <w:r>
-        <w:rPr>
-          <w:b/>
-          <w:bCs/>
-        </w:rPr>
-        <w:tab/>
-      </w:r>
-      <w:r>
-        <w:rPr>
-          <w:b/>
-          <w:bCs/>
-        </w:rPr>
-        <w:tab/>
-        <w:t>Echo Request</w:t>
-      </w:r>
-      <w:r>
-        <w:rPr>
-          <w:b/>
-          <w:bCs/>
-        </w:rPr>
-        <w:tab/>
-      </w:r>
-      <w:r>
-        <w:rPr>
-          <w:b/>
-          <w:bCs/>
-        </w:rPr>
-        <w:tab/>
-      </w:r>
-      <w:r>
-        <w:rPr>
-          <w:b/>
-          <w:bCs/>
-        </w:rPr>
-        <w:tab/>
-        <w:t>Echo Reply</w:t>
-      </w:r>
-    </w:p>
-    <w:p>
-      <w:r>
-        <w:lastRenderedPageBreak/>
-        <w:t>Source IP</w:t>
-      </w:r>
-      <w:r>
-        <w:tab/>
-      </w:r>
-      <w:r>
-        <w:tab/>
-        <w:t xml:space="preserve">              -</w:t>
-      </w:r>
-      <w:r>
-        <w:tab/>
-      </w:r>
-      <w:r>
-        <w:tab/>
-      </w:r>
-      <w:r>
-        <w:tab/>
-      </w:r>
-      <w:r>
-        <w:tab/>
-      </w:r>
-      <w:r>
-        <w:tab/>
-        <w:t>-</w:t>
-      </w:r>
-    </w:p>
-    <w:p>
-      <w:r>
-        <w:t>Destination IP</w:t>
-      </w:r>
-      <w:r>
-        <w:tab/>
-      </w:r>
-      <w:r>
-        <w:tab/>
-        <w:t>-</w:t>
-      </w:r>
-      <w:r>
-        <w:tab/>
-      </w:r>
-      <w:r>
-        <w:tab/>
-      </w:r>
-      <w:r>
-        <w:tab/>
-      </w:r>
-      <w:r>
-        <w:tab/>
-      </w:r>
-      <w:r>
-        <w:tab/>
-        <w:t>-</w:t>
-      </w:r>
-    </w:p>
-    <w:p/>
-    <w:p/>
-    <w:p/>
-    <w:p>
-      <w:pPr>
-        <w:pStyle w:val="Heading2"/>
-        <w:rPr>
-          <w:b/>
-          <w:bCs/>
-        </w:rPr>
-      </w:pPr>
-      <w:r>
-        <w:rPr>
-          <w:b/>
-          <w:bCs/>
-        </w:rPr>
-        <w:t>Compare the Three Tools</w:t>
-      </w:r>
-      <w:r>
-        <w:rPr>
-          <w:b/>
-          <w:bCs/>
-        </w:rPr>
-        <w:t>:</w:t>
-      </w:r>
-    </w:p>
-    <w:p>
-      <w:pPr>
-        <w:pStyle w:val="Heading3"/>
-      </w:pPr>
-      <w:r>
-        <w:t>Ping</w:t>
-      </w:r>
-    </w:p>
-    <w:p>
-      <w:pPr>
-        <w:pStyle w:val="BodyText"/>
-        <w:rPr>
-          <w:rFonts w:asciiTheme="minorHAnsi" w:hAnsiTheme="minorHAnsi"/>
-        </w:rPr>
-      </w:pPr>
-      <w:r>
-        <w:rPr>
-          <w:rFonts w:asciiTheme="minorHAnsi" w:hAnsiTheme="minorHAnsi"/>
-        </w:rPr>
-        <w:t>Shows</w:t>
-      </w:r>
-      <w:r>
-        <w:rPr>
-          <w:rFonts w:asciiTheme="minorHAnsi" w:hAnsiTheme="minorHAnsi"/>
-          <w:spacing w:val="-3"/>
-        </w:rPr>
-        <w:t xml:space="preserve"> </w:t>
-      </w:r>
-      <w:r>
-        <w:rPr>
-          <w:rFonts w:asciiTheme="minorHAnsi" w:hAnsiTheme="minorHAnsi"/>
-        </w:rPr>
-        <w:t>whether</w:t>
-      </w:r>
-      <w:r>
-        <w:rPr>
-          <w:rFonts w:asciiTheme="minorHAnsi" w:hAnsiTheme="minorHAnsi"/>
-          <w:spacing w:val="-3"/>
-        </w:rPr>
-        <w:t xml:space="preserve"> </w:t>
-      </w:r>
-      <w:r>
-        <w:rPr>
-          <w:rFonts w:asciiTheme="minorHAnsi" w:hAnsiTheme="minorHAnsi"/>
-        </w:rPr>
-        <w:t>replies</w:t>
-      </w:r>
-      <w:r>
-        <w:rPr>
-          <w:rFonts w:asciiTheme="minorHAnsi" w:hAnsiTheme="minorHAnsi"/>
-          <w:spacing w:val="-3"/>
-        </w:rPr>
-        <w:t xml:space="preserve"> </w:t>
-      </w:r>
-      <w:r>
-        <w:rPr>
-          <w:rFonts w:asciiTheme="minorHAnsi" w:hAnsiTheme="minorHAnsi"/>
-        </w:rPr>
-        <w:t>were</w:t>
-      </w:r>
-      <w:r>
-        <w:rPr>
-          <w:rFonts w:asciiTheme="minorHAnsi" w:hAnsiTheme="minorHAnsi"/>
-          <w:spacing w:val="-3"/>
-        </w:rPr>
-        <w:t xml:space="preserve"> </w:t>
-      </w:r>
-      <w:r>
-        <w:rPr>
-          <w:rFonts w:asciiTheme="minorHAnsi" w:hAnsiTheme="minorHAnsi"/>
-          <w:spacing w:val="-2"/>
-        </w:rPr>
-        <w:t>received.</w:t>
-      </w:r>
-    </w:p>
-    <w:p>
-      <w:pPr>
-        <w:pStyle w:val="Heading3"/>
-      </w:pPr>
-      <w:r>
-        <w:t>Packet Tracer</w:t>
-      </w:r>
-    </w:p>
-    <w:p>
-      <w:pPr>
-        <w:rPr>
-          <w:spacing w:val="-2"/>
-        </w:rPr>
-      </w:pPr>
-      <w:r>
-        <w:t>Shows</w:t>
-      </w:r>
-      <w:r>
-        <w:rPr>
-          <w:spacing w:val="-2"/>
-        </w:rPr>
-        <w:t xml:space="preserve"> </w:t>
-      </w:r>
-      <w:r>
-        <w:t>a</w:t>
-      </w:r>
-      <w:r>
-        <w:rPr>
-          <w:spacing w:val="-2"/>
-        </w:rPr>
-        <w:t xml:space="preserve"> </w:t>
-      </w:r>
-      <w:r>
-        <w:t>simulated</w:t>
-      </w:r>
-      <w:r>
-        <w:rPr>
-          <w:spacing w:val="-2"/>
-        </w:rPr>
-        <w:t xml:space="preserve"> </w:t>
-      </w:r>
-      <w:r>
-        <w:t>packet</w:t>
-      </w:r>
-      <w:r>
-        <w:rPr>
-          <w:spacing w:val="-1"/>
-        </w:rPr>
-        <w:t xml:space="preserve"> </w:t>
-      </w:r>
-      <w:r>
-        <w:t>moving</w:t>
-      </w:r>
-      <w:r>
-        <w:rPr>
-          <w:spacing w:val="-2"/>
-        </w:rPr>
-        <w:t xml:space="preserve"> </w:t>
-      </w:r>
-      <w:r>
-        <w:t>through</w:t>
-      </w:r>
-      <w:r>
-        <w:rPr>
-          <w:spacing w:val="-2"/>
-        </w:rPr>
-        <w:t xml:space="preserve"> </w:t>
-      </w:r>
-      <w:r>
-        <w:t>network</w:t>
-      </w:r>
-      <w:r>
-        <w:rPr>
-          <w:spacing w:val="-1"/>
-        </w:rPr>
-        <w:t xml:space="preserve"> </w:t>
-      </w:r>
-      <w:r>
-        <w:rPr>
-          <w:spacing w:val="-2"/>
-        </w:rPr>
-        <w:t>devices.</w:t>
-      </w:r>
-    </w:p>
-    <w:p>
-      <w:pPr>
-        <w:pStyle w:val="Heading3"/>
-      </w:pPr>
-      <w:r>
-        <w:t>Wireshark</w:t>
-      </w:r>
-    </w:p>
-    <w:p>
-      <w:pPr>
-        <w:rPr>
-          <w:b/>
-        </w:rPr>
-      </w:pPr>
-      <w:r>
-        <w:t>Shows</w:t>
-      </w:r>
-      <w:r>
-        <w:rPr>
-          <w:spacing w:val="-1"/>
-        </w:rPr>
-        <w:t xml:space="preserve"> </w:t>
-      </w:r>
-      <w:r>
-        <w:t>details of</w:t>
-      </w:r>
-      <w:r>
-        <w:rPr>
-          <w:spacing w:val="-1"/>
-        </w:rPr>
-        <w:t xml:space="preserve"> </w:t>
-      </w:r>
-      <w:r>
-        <w:t>actual packets</w:t>
-      </w:r>
-      <w:r>
-        <w:rPr>
-          <w:spacing w:val="-1"/>
-        </w:rPr>
-        <w:t xml:space="preserve"> </w:t>
-      </w:r>
-      <w:r>
-        <w:t>seen on</w:t>
-      </w:r>
-      <w:r>
-        <w:rPr>
-          <w:spacing w:val="-1"/>
-        </w:rPr>
-        <w:t xml:space="preserve"> </w:t>
-      </w:r>
-      <w:r>
-        <w:t xml:space="preserve">the selected </w:t>
-      </w:r>
-      <w:r>
-        <w:rPr>
-          <w:spacing w:val="-2"/>
-        </w:rPr>
-        <w:t>interface.</w:t>
+        <w:t>git push -u origin feature/</w:t>
+      </w:r>
+      <w:proofErr w:type="spellStart"/>
+      <w:r>
+        <w:t>gb</w:t>
+      </w:r>
+      <w:proofErr w:type="spellEnd"/>
+      <w:r>
+        <w:t>-output</w:t>
       </w:r>
     </w:p>
     <w:sectPr>
-      <w:headerReference w:type="default" r:id="rId15"/>
-      <w:footerReference w:type="default" r:id="rId16"/>
+      <w:headerReference w:type="default" r:id="rId13"/>
+      <w:footerReference w:type="default" r:id="rId14"/>
       <w:pgSz w:w="11906" w:h="16838"/>
       <w:pgMar w:top="1440" w:right="1440" w:bottom="1440" w:left="1440" w:header="850" w:footer="425" w:gutter="0"/>
       <w:pgBorders w:offsetFrom="page">
@@ -5723,6 +3216,119 @@
     </w:lvl>
   </w:abstractNum>
   <w:abstractNum w:abstractNumId="6" w15:restartNumberingAfterBreak="0">
+    <w:nsid w:val="2FA34C08"/>
+    <w:multiLevelType w:val="hybridMultilevel"/>
+    <w:tmpl w:val="3080EDE0"/>
+    <w:lvl w:ilvl="0" w:tplc="20000001">
+      <w:start w:val="1"/>
+      <w:numFmt w:val="bullet"/>
+      <w:lvlText w:val=""/>
+      <w:lvlJc w:val="left"/>
+      <w:pPr>
+        <w:ind w:left="720" w:hanging="360"/>
+      </w:pPr>
+      <w:rPr>
+        <w:rFonts w:ascii="Symbol" w:hAnsi="Symbol" w:hint="default"/>
+      </w:rPr>
+    </w:lvl>
+    <w:lvl w:ilvl="1" w:tplc="20000003" w:tentative="1">
+      <w:start w:val="1"/>
+      <w:numFmt w:val="bullet"/>
+      <w:lvlText w:val="o"/>
+      <w:lvlJc w:val="left"/>
+      <w:pPr>
+        <w:ind w:left="1440" w:hanging="360"/>
+      </w:pPr>
+      <w:rPr>
+        <w:rFonts w:ascii="Courier New" w:hAnsi="Courier New" w:cs="Courier New" w:hint="default"/>
+      </w:rPr>
+    </w:lvl>
+    <w:lvl w:ilvl="2" w:tplc="20000005" w:tentative="1">
+      <w:start w:val="1"/>
+      <w:numFmt w:val="bullet"/>
+      <w:lvlText w:val=""/>
+      <w:lvlJc w:val="left"/>
+      <w:pPr>
+        <w:ind w:left="2160" w:hanging="360"/>
+      </w:pPr>
+      <w:rPr>
+        <w:rFonts w:ascii="Wingdings" w:hAnsi="Wingdings" w:hint="default"/>
+      </w:rPr>
+    </w:lvl>
+    <w:lvl w:ilvl="3" w:tplc="20000001" w:tentative="1">
+      <w:start w:val="1"/>
+      <w:numFmt w:val="bullet"/>
+      <w:lvlText w:val=""/>
+      <w:lvlJc w:val="left"/>
+      <w:pPr>
+        <w:ind w:left="2880" w:hanging="360"/>
+      </w:pPr>
+      <w:rPr>
+        <w:rFonts w:ascii="Symbol" w:hAnsi="Symbol" w:hint="default"/>
+      </w:rPr>
+    </w:lvl>
+    <w:lvl w:ilvl="4" w:tplc="20000003" w:tentative="1">
+      <w:start w:val="1"/>
+      <w:numFmt w:val="bullet"/>
+      <w:lvlText w:val="o"/>
+      <w:lvlJc w:val="left"/>
+      <w:pPr>
+        <w:ind w:left="3600" w:hanging="360"/>
+      </w:pPr>
+      <w:rPr>
+        <w:rFonts w:ascii="Courier New" w:hAnsi="Courier New" w:cs="Courier New" w:hint="default"/>
+      </w:rPr>
+    </w:lvl>
+    <w:lvl w:ilvl="5" w:tplc="20000005" w:tentative="1">
+      <w:start w:val="1"/>
+      <w:numFmt w:val="bullet"/>
+      <w:lvlText w:val=""/>
+      <w:lvlJc w:val="left"/>
+      <w:pPr>
+        <w:ind w:left="4320" w:hanging="360"/>
+      </w:pPr>
+      <w:rPr>
+        <w:rFonts w:ascii="Wingdings" w:hAnsi="Wingdings" w:hint="default"/>
+      </w:rPr>
+    </w:lvl>
+    <w:lvl w:ilvl="6" w:tplc="20000001" w:tentative="1">
+      <w:start w:val="1"/>
+      <w:numFmt w:val="bullet"/>
+      <w:lvlText w:val=""/>
+      <w:lvlJc w:val="left"/>
+      <w:pPr>
+        <w:ind w:left="5040" w:hanging="360"/>
+      </w:pPr>
+      <w:rPr>
+        <w:rFonts w:ascii="Symbol" w:hAnsi="Symbol" w:hint="default"/>
+      </w:rPr>
+    </w:lvl>
+    <w:lvl w:ilvl="7" w:tplc="20000003" w:tentative="1">
+      <w:start w:val="1"/>
+      <w:numFmt w:val="bullet"/>
+      <w:lvlText w:val="o"/>
+      <w:lvlJc w:val="left"/>
+      <w:pPr>
+        <w:ind w:left="5760" w:hanging="360"/>
+      </w:pPr>
+      <w:rPr>
+        <w:rFonts w:ascii="Courier New" w:hAnsi="Courier New" w:cs="Courier New" w:hint="default"/>
+      </w:rPr>
+    </w:lvl>
+    <w:lvl w:ilvl="8" w:tplc="20000005" w:tentative="1">
+      <w:start w:val="1"/>
+      <w:numFmt w:val="bullet"/>
+      <w:lvlText w:val=""/>
+      <w:lvlJc w:val="left"/>
+      <w:pPr>
+        <w:ind w:left="6480" w:hanging="360"/>
+      </w:pPr>
+      <w:rPr>
+        <w:rFonts w:ascii="Wingdings" w:hAnsi="Wingdings" w:hint="default"/>
+      </w:rPr>
+    </w:lvl>
+  </w:abstractNum>
+  <w:abstractNum w:abstractNumId="7" w15:restartNumberingAfterBreak="0">
     <w:nsid w:val="32935C3D"/>
     <w:multiLevelType w:val="hybridMultilevel"/>
     <w:tmpl w:val="BF524E7C"/>
@@ -5852,7 +3458,7 @@
       </w:rPr>
     </w:lvl>
   </w:abstractNum>
-  <w:abstractNum w:abstractNumId="7" w15:restartNumberingAfterBreak="0">
+  <w:abstractNum w:abstractNumId="8" w15:restartNumberingAfterBreak="0">
     <w:nsid w:val="36870EFB"/>
     <w:multiLevelType w:val="hybridMultilevel"/>
     <w:tmpl w:val="B63A6F3C"/>
@@ -5965,7 +3571,120 @@
       </w:rPr>
     </w:lvl>
   </w:abstractNum>
-  <w:abstractNum w:abstractNumId="8" w15:restartNumberingAfterBreak="0">
+  <w:abstractNum w:abstractNumId="9" w15:restartNumberingAfterBreak="0">
+    <w:nsid w:val="39B17AA9"/>
+    <w:multiLevelType w:val="hybridMultilevel"/>
+    <w:tmpl w:val="F5B008E2"/>
+    <w:lvl w:ilvl="0" w:tplc="20000001">
+      <w:start w:val="1"/>
+      <w:numFmt w:val="bullet"/>
+      <w:lvlText w:val=""/>
+      <w:lvlJc w:val="left"/>
+      <w:pPr>
+        <w:ind w:left="720" w:hanging="360"/>
+      </w:pPr>
+      <w:rPr>
+        <w:rFonts w:ascii="Symbol" w:hAnsi="Symbol" w:hint="default"/>
+      </w:rPr>
+    </w:lvl>
+    <w:lvl w:ilvl="1" w:tplc="20000003" w:tentative="1">
+      <w:start w:val="1"/>
+      <w:numFmt w:val="bullet"/>
+      <w:lvlText w:val="o"/>
+      <w:lvlJc w:val="left"/>
+      <w:pPr>
+        <w:ind w:left="1440" w:hanging="360"/>
+      </w:pPr>
+      <w:rPr>
+        <w:rFonts w:ascii="Courier New" w:hAnsi="Courier New" w:cs="Courier New" w:hint="default"/>
+      </w:rPr>
+    </w:lvl>
+    <w:lvl w:ilvl="2" w:tplc="20000005" w:tentative="1">
+      <w:start w:val="1"/>
+      <w:numFmt w:val="bullet"/>
+      <w:lvlText w:val=""/>
+      <w:lvlJc w:val="left"/>
+      <w:pPr>
+        <w:ind w:left="2160" w:hanging="360"/>
+      </w:pPr>
+      <w:rPr>
+        <w:rFonts w:ascii="Wingdings" w:hAnsi="Wingdings" w:hint="default"/>
+      </w:rPr>
+    </w:lvl>
+    <w:lvl w:ilvl="3" w:tplc="20000001" w:tentative="1">
+      <w:start w:val="1"/>
+      <w:numFmt w:val="bullet"/>
+      <w:lvlText w:val=""/>
+      <w:lvlJc w:val="left"/>
+      <w:pPr>
+        <w:ind w:left="2880" w:hanging="360"/>
+      </w:pPr>
+      <w:rPr>
+        <w:rFonts w:ascii="Symbol" w:hAnsi="Symbol" w:hint="default"/>
+      </w:rPr>
+    </w:lvl>
+    <w:lvl w:ilvl="4" w:tplc="20000003" w:tentative="1">
+      <w:start w:val="1"/>
+      <w:numFmt w:val="bullet"/>
+      <w:lvlText w:val="o"/>
+      <w:lvlJc w:val="left"/>
+      <w:pPr>
+        <w:ind w:left="3600" w:hanging="360"/>
+      </w:pPr>
+      <w:rPr>
+        <w:rFonts w:ascii="Courier New" w:hAnsi="Courier New" w:cs="Courier New" w:hint="default"/>
+      </w:rPr>
+    </w:lvl>
+    <w:lvl w:ilvl="5" w:tplc="20000005" w:tentative="1">
+      <w:start w:val="1"/>
+      <w:numFmt w:val="bullet"/>
+      <w:lvlText w:val=""/>
+      <w:lvlJc w:val="left"/>
+      <w:pPr>
+        <w:ind w:left="4320" w:hanging="360"/>
+      </w:pPr>
+      <w:rPr>
+        <w:rFonts w:ascii="Wingdings" w:hAnsi="Wingdings" w:hint="default"/>
+      </w:rPr>
+    </w:lvl>
+    <w:lvl w:ilvl="6" w:tplc="20000001" w:tentative="1">
+      <w:start w:val="1"/>
+      <w:numFmt w:val="bullet"/>
+      <w:lvlText w:val=""/>
+      <w:lvlJc w:val="left"/>
+      <w:pPr>
+        <w:ind w:left="5040" w:hanging="360"/>
+      </w:pPr>
+      <w:rPr>
+        <w:rFonts w:ascii="Symbol" w:hAnsi="Symbol" w:hint="default"/>
+      </w:rPr>
+    </w:lvl>
+    <w:lvl w:ilvl="7" w:tplc="20000003" w:tentative="1">
+      <w:start w:val="1"/>
+      <w:numFmt w:val="bullet"/>
+      <w:lvlText w:val="o"/>
+      <w:lvlJc w:val="left"/>
+      <w:pPr>
+        <w:ind w:left="5760" w:hanging="360"/>
+      </w:pPr>
+      <w:rPr>
+        <w:rFonts w:ascii="Courier New" w:hAnsi="Courier New" w:cs="Courier New" w:hint="default"/>
+      </w:rPr>
+    </w:lvl>
+    <w:lvl w:ilvl="8" w:tplc="20000005" w:tentative="1">
+      <w:start w:val="1"/>
+      <w:numFmt w:val="bullet"/>
+      <w:lvlText w:val=""/>
+      <w:lvlJc w:val="left"/>
+      <w:pPr>
+        <w:ind w:left="6480" w:hanging="360"/>
+      </w:pPr>
+      <w:rPr>
+        <w:rFonts w:ascii="Wingdings" w:hAnsi="Wingdings" w:hint="default"/>
+      </w:rPr>
+    </w:lvl>
+  </w:abstractNum>
+  <w:abstractNum w:abstractNumId="10" w15:restartNumberingAfterBreak="0">
     <w:nsid w:val="40D62384"/>
     <w:multiLevelType w:val="hybridMultilevel"/>
     <w:tmpl w:val="73F280C6"/>
@@ -6104,7 +3823,7 @@
       </w:rPr>
     </w:lvl>
   </w:abstractNum>
-  <w:abstractNum w:abstractNumId="9" w15:restartNumberingAfterBreak="0">
+  <w:abstractNum w:abstractNumId="11" w15:restartNumberingAfterBreak="0">
     <w:nsid w:val="41DF5911"/>
     <w:multiLevelType w:val="hybridMultilevel"/>
     <w:tmpl w:val="3FA29996"/>
@@ -6217,7 +3936,7 @@
       </w:rPr>
     </w:lvl>
   </w:abstractNum>
-  <w:abstractNum w:abstractNumId="10" w15:restartNumberingAfterBreak="0">
+  <w:abstractNum w:abstractNumId="12" w15:restartNumberingAfterBreak="0">
     <w:nsid w:val="443976EC"/>
     <w:multiLevelType w:val="hybridMultilevel"/>
     <w:tmpl w:val="41582A02"/>
@@ -6303,7 +4022,7 @@
       </w:pPr>
     </w:lvl>
   </w:abstractNum>
-  <w:abstractNum w:abstractNumId="11" w15:restartNumberingAfterBreak="0">
+  <w:abstractNum w:abstractNumId="13" w15:restartNumberingAfterBreak="0">
     <w:nsid w:val="45CE2B03"/>
     <w:multiLevelType w:val="hybridMultilevel"/>
     <w:tmpl w:val="B23EA16C"/>
@@ -6416,7 +4135,7 @@
       </w:rPr>
     </w:lvl>
   </w:abstractNum>
-  <w:abstractNum w:abstractNumId="12" w15:restartNumberingAfterBreak="0">
+  <w:abstractNum w:abstractNumId="14" w15:restartNumberingAfterBreak="0">
     <w:nsid w:val="4BE95E8B"/>
     <w:multiLevelType w:val="hybridMultilevel"/>
     <w:tmpl w:val="B404A0F2"/>
@@ -6546,7 +4265,7 @@
       </w:rPr>
     </w:lvl>
   </w:abstractNum>
-  <w:abstractNum w:abstractNumId="13" w15:restartNumberingAfterBreak="0">
+  <w:abstractNum w:abstractNumId="15" w15:restartNumberingAfterBreak="0">
     <w:nsid w:val="58CE24D1"/>
     <w:multiLevelType w:val="hybridMultilevel"/>
     <w:tmpl w:val="3578C366"/>
@@ -6668,7 +4387,120 @@
       </w:rPr>
     </w:lvl>
   </w:abstractNum>
-  <w:abstractNum w:abstractNumId="14" w15:restartNumberingAfterBreak="0">
+  <w:abstractNum w:abstractNumId="16" w15:restartNumberingAfterBreak="0">
+    <w:nsid w:val="594B650B"/>
+    <w:multiLevelType w:val="hybridMultilevel"/>
+    <w:tmpl w:val="6D3C0E00"/>
+    <w:lvl w:ilvl="0" w:tplc="20000001">
+      <w:start w:val="1"/>
+      <w:numFmt w:val="bullet"/>
+      <w:lvlText w:val=""/>
+      <w:lvlJc w:val="left"/>
+      <w:pPr>
+        <w:ind w:left="720" w:hanging="360"/>
+      </w:pPr>
+      <w:rPr>
+        <w:rFonts w:ascii="Symbol" w:hAnsi="Symbol" w:hint="default"/>
+      </w:rPr>
+    </w:lvl>
+    <w:lvl w:ilvl="1" w:tplc="20000003" w:tentative="1">
+      <w:start w:val="1"/>
+      <w:numFmt w:val="bullet"/>
+      <w:lvlText w:val="o"/>
+      <w:lvlJc w:val="left"/>
+      <w:pPr>
+        <w:ind w:left="1440" w:hanging="360"/>
+      </w:pPr>
+      <w:rPr>
+        <w:rFonts w:ascii="Courier New" w:hAnsi="Courier New" w:cs="Courier New" w:hint="default"/>
+      </w:rPr>
+    </w:lvl>
+    <w:lvl w:ilvl="2" w:tplc="20000005" w:tentative="1">
+      <w:start w:val="1"/>
+      <w:numFmt w:val="bullet"/>
+      <w:lvlText w:val=""/>
+      <w:lvlJc w:val="left"/>
+      <w:pPr>
+        <w:ind w:left="2160" w:hanging="360"/>
+      </w:pPr>
+      <w:rPr>
+        <w:rFonts w:ascii="Wingdings" w:hAnsi="Wingdings" w:hint="default"/>
+      </w:rPr>
+    </w:lvl>
+    <w:lvl w:ilvl="3" w:tplc="20000001" w:tentative="1">
+      <w:start w:val="1"/>
+      <w:numFmt w:val="bullet"/>
+      <w:lvlText w:val=""/>
+      <w:lvlJc w:val="left"/>
+      <w:pPr>
+        <w:ind w:left="2880" w:hanging="360"/>
+      </w:pPr>
+      <w:rPr>
+        <w:rFonts w:ascii="Symbol" w:hAnsi="Symbol" w:hint="default"/>
+      </w:rPr>
+    </w:lvl>
+    <w:lvl w:ilvl="4" w:tplc="20000003" w:tentative="1">
+      <w:start w:val="1"/>
+      <w:numFmt w:val="bullet"/>
+      <w:lvlText w:val="o"/>
+      <w:lvlJc w:val="left"/>
+      <w:pPr>
+        <w:ind w:left="3600" w:hanging="360"/>
+      </w:pPr>
+      <w:rPr>
+        <w:rFonts w:ascii="Courier New" w:hAnsi="Courier New" w:cs="Courier New" w:hint="default"/>
+      </w:rPr>
+    </w:lvl>
+    <w:lvl w:ilvl="5" w:tplc="20000005" w:tentative="1">
+      <w:start w:val="1"/>
+      <w:numFmt w:val="bullet"/>
+      <w:lvlText w:val=""/>
+      <w:lvlJc w:val="left"/>
+      <w:pPr>
+        <w:ind w:left="4320" w:hanging="360"/>
+      </w:pPr>
+      <w:rPr>
+        <w:rFonts w:ascii="Wingdings" w:hAnsi="Wingdings" w:hint="default"/>
+      </w:rPr>
+    </w:lvl>
+    <w:lvl w:ilvl="6" w:tplc="20000001" w:tentative="1">
+      <w:start w:val="1"/>
+      <w:numFmt w:val="bullet"/>
+      <w:lvlText w:val=""/>
+      <w:lvlJc w:val="left"/>
+      <w:pPr>
+        <w:ind w:left="5040" w:hanging="360"/>
+      </w:pPr>
+      <w:rPr>
+        <w:rFonts w:ascii="Symbol" w:hAnsi="Symbol" w:hint="default"/>
+      </w:rPr>
+    </w:lvl>
+    <w:lvl w:ilvl="7" w:tplc="20000003" w:tentative="1">
+      <w:start w:val="1"/>
+      <w:numFmt w:val="bullet"/>
+      <w:lvlText w:val="o"/>
+      <w:lvlJc w:val="left"/>
+      <w:pPr>
+        <w:ind w:left="5760" w:hanging="360"/>
+      </w:pPr>
+      <w:rPr>
+        <w:rFonts w:ascii="Courier New" w:hAnsi="Courier New" w:cs="Courier New" w:hint="default"/>
+      </w:rPr>
+    </w:lvl>
+    <w:lvl w:ilvl="8" w:tplc="20000005" w:tentative="1">
+      <w:start w:val="1"/>
+      <w:numFmt w:val="bullet"/>
+      <w:lvlText w:val=""/>
+      <w:lvlJc w:val="left"/>
+      <w:pPr>
+        <w:ind w:left="6480" w:hanging="360"/>
+      </w:pPr>
+      <w:rPr>
+        <w:rFonts w:ascii="Wingdings" w:hAnsi="Wingdings" w:hint="default"/>
+      </w:rPr>
+    </w:lvl>
+  </w:abstractNum>
+  <w:abstractNum w:abstractNumId="17" w15:restartNumberingAfterBreak="0">
     <w:nsid w:val="5BA47097"/>
     <w:multiLevelType w:val="hybridMultilevel"/>
     <w:tmpl w:val="4E86F5BC"/>
@@ -6781,7 +4613,7 @@
       </w:rPr>
     </w:lvl>
   </w:abstractNum>
-  <w:abstractNum w:abstractNumId="15" w15:restartNumberingAfterBreak="0">
+  <w:abstractNum w:abstractNumId="18" w15:restartNumberingAfterBreak="0">
     <w:nsid w:val="63882D8B"/>
     <w:multiLevelType w:val="hybridMultilevel"/>
     <w:tmpl w:val="EBA4941E"/>
@@ -6903,7 +4735,120 @@
       </w:rPr>
     </w:lvl>
   </w:abstractNum>
-  <w:abstractNum w:abstractNumId="16" w15:restartNumberingAfterBreak="0">
+  <w:abstractNum w:abstractNumId="19" w15:restartNumberingAfterBreak="0">
+    <w:nsid w:val="686B1E70"/>
+    <w:multiLevelType w:val="hybridMultilevel"/>
+    <w:tmpl w:val="B9DE13B0"/>
+    <w:lvl w:ilvl="0" w:tplc="20000001">
+      <w:start w:val="1"/>
+      <w:numFmt w:val="bullet"/>
+      <w:lvlText w:val=""/>
+      <w:lvlJc w:val="left"/>
+      <w:pPr>
+        <w:ind w:left="720" w:hanging="360"/>
+      </w:pPr>
+      <w:rPr>
+        <w:rFonts w:ascii="Symbol" w:hAnsi="Symbol" w:hint="default"/>
+      </w:rPr>
+    </w:lvl>
+    <w:lvl w:ilvl="1" w:tplc="20000003" w:tentative="1">
+      <w:start w:val="1"/>
+      <w:numFmt w:val="bullet"/>
+      <w:lvlText w:val="o"/>
+      <w:lvlJc w:val="left"/>
+      <w:pPr>
+        <w:ind w:left="1440" w:hanging="360"/>
+      </w:pPr>
+      <w:rPr>
+        <w:rFonts w:ascii="Courier New" w:hAnsi="Courier New" w:cs="Courier New" w:hint="default"/>
+      </w:rPr>
+    </w:lvl>
+    <w:lvl w:ilvl="2" w:tplc="20000005" w:tentative="1">
+      <w:start w:val="1"/>
+      <w:numFmt w:val="bullet"/>
+      <w:lvlText w:val=""/>
+      <w:lvlJc w:val="left"/>
+      <w:pPr>
+        <w:ind w:left="2160" w:hanging="360"/>
+      </w:pPr>
+      <w:rPr>
+        <w:rFonts w:ascii="Wingdings" w:hAnsi="Wingdings" w:hint="default"/>
+      </w:rPr>
+    </w:lvl>
+    <w:lvl w:ilvl="3" w:tplc="20000001" w:tentative="1">
+      <w:start w:val="1"/>
+      <w:numFmt w:val="bullet"/>
+      <w:lvlText w:val=""/>
+      <w:lvlJc w:val="left"/>
+      <w:pPr>
+        <w:ind w:left="2880" w:hanging="360"/>
+      </w:pPr>
+      <w:rPr>
+        <w:rFonts w:ascii="Symbol" w:hAnsi="Symbol" w:hint="default"/>
+      </w:rPr>
+    </w:lvl>
+    <w:lvl w:ilvl="4" w:tplc="20000003" w:tentative="1">
+      <w:start w:val="1"/>
+      <w:numFmt w:val="bullet"/>
+      <w:lvlText w:val="o"/>
+      <w:lvlJc w:val="left"/>
+      <w:pPr>
+        <w:ind w:left="3600" w:hanging="360"/>
+      </w:pPr>
+      <w:rPr>
+        <w:rFonts w:ascii="Courier New" w:hAnsi="Courier New" w:cs="Courier New" w:hint="default"/>
+      </w:rPr>
+    </w:lvl>
+    <w:lvl w:ilvl="5" w:tplc="20000005" w:tentative="1">
+      <w:start w:val="1"/>
+      <w:numFmt w:val="bullet"/>
+      <w:lvlText w:val=""/>
+      <w:lvlJc w:val="left"/>
+      <w:pPr>
+        <w:ind w:left="4320" w:hanging="360"/>
+      </w:pPr>
+      <w:rPr>
+        <w:rFonts w:ascii="Wingdings" w:hAnsi="Wingdings" w:hint="default"/>
+      </w:rPr>
+    </w:lvl>
+    <w:lvl w:ilvl="6" w:tplc="20000001" w:tentative="1">
+      <w:start w:val="1"/>
+      <w:numFmt w:val="bullet"/>
+      <w:lvlText w:val=""/>
+      <w:lvlJc w:val="left"/>
+      <w:pPr>
+        <w:ind w:left="5040" w:hanging="360"/>
+      </w:pPr>
+      <w:rPr>
+        <w:rFonts w:ascii="Symbol" w:hAnsi="Symbol" w:hint="default"/>
+      </w:rPr>
+    </w:lvl>
+    <w:lvl w:ilvl="7" w:tplc="20000003" w:tentative="1">
+      <w:start w:val="1"/>
+      <w:numFmt w:val="bullet"/>
+      <w:lvlText w:val="o"/>
+      <w:lvlJc w:val="left"/>
+      <w:pPr>
+        <w:ind w:left="5760" w:hanging="360"/>
+      </w:pPr>
+      <w:rPr>
+        <w:rFonts w:ascii="Courier New" w:hAnsi="Courier New" w:cs="Courier New" w:hint="default"/>
+      </w:rPr>
+    </w:lvl>
+    <w:lvl w:ilvl="8" w:tplc="20000005" w:tentative="1">
+      <w:start w:val="1"/>
+      <w:numFmt w:val="bullet"/>
+      <w:lvlText w:val=""/>
+      <w:lvlJc w:val="left"/>
+      <w:pPr>
+        <w:ind w:left="6480" w:hanging="360"/>
+      </w:pPr>
+      <w:rPr>
+        <w:rFonts w:ascii="Wingdings" w:hAnsi="Wingdings" w:hint="default"/>
+      </w:rPr>
+    </w:lvl>
+  </w:abstractNum>
+  <w:abstractNum w:abstractNumId="20" w15:restartNumberingAfterBreak="0">
     <w:nsid w:val="71F507CA"/>
     <w:multiLevelType w:val="hybridMultilevel"/>
     <w:tmpl w:val="09F08828"/>
@@ -7017,34 +4962,34 @@
     </w:lvl>
   </w:abstractNum>
   <w:num w:numId="1" w16cid:durableId="1760251548">
-    <w:abstractNumId w:val="13"/>
+    <w:abstractNumId w:val="15"/>
   </w:num>
   <w:num w:numId="2" w16cid:durableId="2002808138">
     <w:abstractNumId w:val="2"/>
   </w:num>
   <w:num w:numId="3" w16cid:durableId="1646858157">
-    <w:abstractNumId w:val="15"/>
+    <w:abstractNumId w:val="18"/>
   </w:num>
   <w:num w:numId="4" w16cid:durableId="1283268582">
-    <w:abstractNumId w:val="8"/>
+    <w:abstractNumId w:val="10"/>
   </w:num>
   <w:num w:numId="5" w16cid:durableId="1396274459">
+    <w:abstractNumId w:val="14"/>
+  </w:num>
+  <w:num w:numId="6" w16cid:durableId="1802571401">
+    <w:abstractNumId w:val="7"/>
+  </w:num>
+  <w:num w:numId="7" w16cid:durableId="1066033430">
     <w:abstractNumId w:val="12"/>
   </w:num>
-  <w:num w:numId="6" w16cid:durableId="1802571401">
-    <w:abstractNumId w:val="6"/>
-  </w:num>
-  <w:num w:numId="7" w16cid:durableId="1066033430">
-    <w:abstractNumId w:val="10"/>
-  </w:num>
   <w:num w:numId="8" w16cid:durableId="1395393610">
-    <w:abstractNumId w:val="11"/>
+    <w:abstractNumId w:val="13"/>
   </w:num>
   <w:num w:numId="9" w16cid:durableId="1291549289">
-    <w:abstractNumId w:val="16"/>
+    <w:abstractNumId w:val="20"/>
   </w:num>
   <w:num w:numId="10" w16cid:durableId="1099302419">
-    <w:abstractNumId w:val="7"/>
+    <w:abstractNumId w:val="8"/>
   </w:num>
   <w:num w:numId="11" w16cid:durableId="1063912354">
     <w:abstractNumId w:val="4"/>
@@ -7053,19 +4998,31 @@
     <w:abstractNumId w:val="5"/>
   </w:num>
   <w:num w:numId="13" w16cid:durableId="1327200843">
-    <w:abstractNumId w:val="14"/>
+    <w:abstractNumId w:val="17"/>
   </w:num>
   <w:num w:numId="14" w16cid:durableId="1653438131">
     <w:abstractNumId w:val="0"/>
   </w:num>
   <w:num w:numId="15" w16cid:durableId="1817066190">
-    <w:abstractNumId w:val="9"/>
+    <w:abstractNumId w:val="11"/>
   </w:num>
   <w:num w:numId="16" w16cid:durableId="571475554">
     <w:abstractNumId w:val="1"/>
   </w:num>
   <w:num w:numId="17" w16cid:durableId="1430153646">
     <w:abstractNumId w:val="3"/>
+  </w:num>
+  <w:num w:numId="18" w16cid:durableId="1925721700">
+    <w:abstractNumId w:val="19"/>
+  </w:num>
+  <w:num w:numId="19" w16cid:durableId="1846437816">
+    <w:abstractNumId w:val="9"/>
+  </w:num>
+  <w:num w:numId="20" w16cid:durableId="1550455327">
+    <w:abstractNumId w:val="16"/>
+  </w:num>
+  <w:num w:numId="21" w16cid:durableId="1808812561">
+    <w:abstractNumId w:val="6"/>
   </w:num>
 </w:numbering>
 </file>
@@ -7670,7 +5627,6 @@
   <w:style w:type="character" w:default="1" w:styleId="DefaultParagraphFont">
     <w:name w:val="Default Paragraph Font"/>
     <w:uiPriority w:val="1"/>
-    <w:semiHidden/>
     <w:unhideWhenUsed/>
   </w:style>
   <w:style w:type="table" w:default="1" w:styleId="TableNormal">
@@ -8126,6 +6082,29 @@
       <w:spacing w:after="0" w:line="240" w:lineRule="auto"/>
     </w:pPr>
   </w:style>
+  <w:style w:type="character" w:styleId="Hyperlink">
+    <w:name w:val="Hyperlink"/>
+    <w:basedOn w:val="DefaultParagraphFont"/>
+    <w:uiPriority w:val="99"/>
+    <w:unhideWhenUsed/>
+    <w:rsid w:val="00913B52"/>
+    <w:rPr>
+      <w:color w:val="467886" w:themeColor="hyperlink"/>
+      <w:u w:val="single"/>
+    </w:rPr>
+  </w:style>
+  <w:style w:type="character" w:styleId="UnresolvedMention">
+    <w:name w:val="Unresolved Mention"/>
+    <w:basedOn w:val="DefaultParagraphFont"/>
+    <w:uiPriority w:val="99"/>
+    <w:semiHidden/>
+    <w:unhideWhenUsed/>
+    <w:rsid w:val="00913B52"/>
+    <w:rPr>
+      <w:color w:val="605E5C"/>
+      <w:shd w:val="clear" w:color="auto" w:fill="E1DFDD"/>
+    </w:rPr>
+  </w:style>
 </w:styles>
 </file>
 
@@ -8264,7 +6243,9 @@
     <w:rsid w:val="00677E64"/>
     <w:rsid w:val="00A943D6"/>
     <w:rsid w:val="00CD6370"/>
+    <w:rsid w:val="00CF354D"/>
     <w:rsid w:val="00D77698"/>
+    <w:rsid w:val="00D8240D"/>
     <w:rsid w:val="00F04181"/>
   </w:rsids>
   <m:mathPr>

</xml_diff>